<commit_message>
docs: refresh final architecture and AI deliverables
</commit_message>
<xml_diff>
--- a/Infra/project-docs/final-delivery/2026-08-17/Musubi_AI_변경사항_최신.docx
+++ b/Infra/project-docs/final-delivery/2026-08-17/Musubi_AI_변경사항_최신.docx
@@ -4,142 +4,2408 @@
   <w:body>
     <w:p>
       <w:pPr>
-        <w:spacing w:after="0"/>
-        <w:jc w:val="center"/>
+        <w:spacing w:after="100"/>
       </w:pPr>
       <w:r>
-        <w:drawing>
-          <wp:inline xmlns:a="http://schemas.openxmlformats.org/drawingml/2006/main" xmlns:pic="http://schemas.openxmlformats.org/drawingml/2006/picture">
-            <wp:extent cx="7196328" cy="10173452"/>
-            <wp:docPr id="1" name="Picture 1"/>
-            <wp:cNvGraphicFramePr>
-              <a:graphicFrameLocks noChangeAspect="1"/>
-            </wp:cNvGraphicFramePr>
-            <a:graphic>
-              <a:graphicData uri="http://schemas.openxmlformats.org/drawingml/2006/picture">
-                <pic:pic>
-                  <pic:nvPicPr>
-                    <pic:cNvPr id="0" name="page-1.png"/>
-                    <pic:cNvPicPr/>
-                  </pic:nvPicPr>
-                  <pic:blipFill>
-                    <a:blip r:embed="rId9"/>
-                    <a:stretch>
-                      <a:fillRect/>
-                    </a:stretch>
-                  </pic:blipFill>
-                  <pic:spPr>
-                    <a:xfrm>
-                      <a:off x="0" y="0"/>
-                      <a:ext cx="7196328" cy="10173452"/>
-                    </a:xfrm>
-                    <a:prstGeom prst="rect"/>
-                  </pic:spPr>
-                </pic:pic>
-              </a:graphicData>
-            </a:graphic>
-          </wp:inline>
-        </w:drawing>
+        <w:rPr>
+          <w:rFonts w:ascii="Arial Unicode MS" w:hAnsi="Arial Unicode MS" w:eastAsia="Arial Unicode MS" w:cs="Arial Unicode MS"/>
+          <w:b/>
+          <w:caps/>
+          <w:color w:val="F59E0B"/>
+          <w:sz w:val="18"/>
+        </w:rPr>
+        <w:t>FINAL PRESENTATION BRIEF</w:t>
       </w:r>
     </w:p>
     <w:p>
+      <w:pPr>
+        <w:pStyle w:val="Title"/>
+      </w:pPr>
       <w:r>
+        <w:rPr>
+          <w:rFonts w:ascii="Arial Unicode MS" w:hAnsi="Arial Unicode MS" w:eastAsia="Arial Unicode MS" w:cs="Arial Unicode MS"/>
+        </w:rPr>
+        <w:t>Musubi AI 변경사항</w:t>
+      </w:r>
+    </w:p>
+    <w:p>
+      <w:pPr>
+        <w:spacing w:after="240"/>
+      </w:pPr>
+      <w:r>
+        <w:rPr>
+          <w:rFonts w:ascii="Arial Unicode MS" w:hAnsi="Arial Unicode MS" w:eastAsia="Arial Unicode MS" w:cs="Arial Unicode MS"/>
+          <w:b w:val="0"/>
+          <w:color w:val="5B6573"/>
+          <w:sz w:val="22"/>
+        </w:rPr>
+        <w:t>Gemma 4 12B 기반 대화·추천 파이프라인 · 운영 반영 기준</w:t>
+      </w:r>
+    </w:p>
+    <w:tbl>
+      <w:tblPr>
+        <w:tblW w:type="dxa" w:w="9360"/>
+        <w:jc w:val="center"/>
+        <w:tblLayout w:type="fixed"/>
+        <w:tblLook w:firstColumn="1" w:firstRow="1" w:lastColumn="0" w:lastRow="0" w:noHBand="0" w:noVBand="1" w:val="04A0"/>
+      </w:tblPr>
+      <w:tblGrid>
+        <w:gridCol w:w="180"/>
+        <w:gridCol w:w="9180"/>
+      </w:tblGrid>
+      <w:tr>
+        <w:tc>
+          <w:tcPr>
+            <w:tcW w:type="dxa" w:w="180"/>
+            <w:vAlign w:val="center"/>
+            <w:shd w:fill="F59E0B"/>
+            <w:tcMar>
+              <w:top w:w="105" w:type="dxa"/>
+              <w:start w:w="125" w:type="dxa"/>
+              <w:bottom w:w="105" w:type="dxa"/>
+              <w:end w:w="125" w:type="dxa"/>
+            </w:tcMar>
+          </w:tcPr>
+          <w:p/>
+        </w:tc>
+        <w:tc>
+          <w:tcPr>
+            <w:tcW w:type="dxa" w:w="9180"/>
+            <w:vAlign w:val="center"/>
+            <w:shd w:fill="FFF4E0"/>
+            <w:tcMar>
+              <w:top w:w="105" w:type="dxa"/>
+              <w:start w:w="125" w:type="dxa"/>
+              <w:bottom w:w="105" w:type="dxa"/>
+              <w:end w:w="125" w:type="dxa"/>
+            </w:tcMar>
+          </w:tcPr>
+          <w:p>
+            <w:pPr>
+              <w:spacing w:after="0"/>
+            </w:pPr>
+            <w:r>
+              <w:rPr>
+                <w:rFonts w:ascii="Arial Unicode MS" w:hAnsi="Arial Unicode MS" w:eastAsia="Arial Unicode MS" w:cs="Arial Unicode MS"/>
+                <w:b/>
+                <w:color w:val="17324D"/>
+                <w:sz w:val="19"/>
+              </w:rPr>
+              <w:t>현재 상태: 검증된 AI 런타임 10개 파일을 GPU-B → GPU-A 순으로 롤링 배포했고, 두 노드의 파일 해시·서비스 health·추천 스모크를 확인했습니다.</w:t>
+            </w:r>
+          </w:p>
+        </w:tc>
+      </w:tr>
+    </w:tbl>
+    <w:p>
+      <w:pPr>
+        <w:spacing w:after="20"/>
+      </w:pPr>
+    </w:p>
+    <w:p>
+      <w:pPr>
+        <w:pStyle w:val="Heading1"/>
+      </w:pPr>
+      <w:r>
+        <w:rPr>
+          <w:rFonts w:ascii="Arial Unicode MS" w:hAnsi="Arial Unicode MS" w:eastAsia="Arial Unicode MS" w:cs="Arial Unicode MS"/>
+        </w:rPr>
+        <w:t>1. 운영 모델과 실행 기준</w:t>
+      </w:r>
+    </w:p>
+    <w:tbl>
+      <w:tblPr>
+        <w:tblStyle w:val="TableGrid"/>
+        <w:tblW w:type="dxa" w:w="9360"/>
+        <w:jc w:val="center"/>
+        <w:tblLayout w:type="fixed"/>
+        <w:tblLook w:firstColumn="1" w:firstRow="1" w:lastColumn="0" w:lastRow="0" w:noHBand="0" w:noVBand="1" w:val="04A0"/>
+      </w:tblPr>
+      <w:tblGrid>
+        <w:gridCol w:w="2200"/>
+        <w:gridCol w:w="7160"/>
+      </w:tblGrid>
+      <w:tr>
+        <w:trPr>
+          <w:tblHeader w:val="true"/>
+        </w:trPr>
+        <w:tc>
+          <w:tcPr>
+            <w:tcW w:type="dxa" w:w="2200"/>
+            <w:vAlign w:val="center"/>
+            <w:shd w:fill="F2F4F7"/>
+            <w:tcMar>
+              <w:top w:w="80" w:type="dxa"/>
+              <w:start w:w="110" w:type="dxa"/>
+              <w:bottom w:w="80" w:type="dxa"/>
+              <w:end w:w="110" w:type="dxa"/>
+            </w:tcMar>
+          </w:tcPr>
+          <w:p>
+            <w:pPr>
+              <w:spacing w:after="0"/>
+            </w:pPr>
+            <w:r>
+              <w:rPr>
+                <w:rFonts w:ascii="Arial Unicode MS" w:hAnsi="Arial Unicode MS" w:eastAsia="Arial Unicode MS" w:cs="Arial Unicode MS"/>
+                <w:b/>
+                <w:color w:val="17324D"/>
+                <w:sz w:val="17"/>
+              </w:rPr>
+              <w:t>항목</w:t>
+            </w:r>
+          </w:p>
+        </w:tc>
+        <w:tc>
+          <w:tcPr>
+            <w:tcW w:type="dxa" w:w="7160"/>
+            <w:vAlign w:val="center"/>
+            <w:shd w:fill="F2F4F7"/>
+            <w:tcMar>
+              <w:top w:w="80" w:type="dxa"/>
+              <w:start w:w="110" w:type="dxa"/>
+              <w:bottom w:w="80" w:type="dxa"/>
+              <w:end w:w="110" w:type="dxa"/>
+            </w:tcMar>
+          </w:tcPr>
+          <w:p>
+            <w:pPr>
+              <w:spacing w:after="0"/>
+            </w:pPr>
+            <w:r>
+              <w:rPr>
+                <w:rFonts w:ascii="Arial Unicode MS" w:hAnsi="Arial Unicode MS" w:eastAsia="Arial Unicode MS" w:cs="Arial Unicode MS"/>
+                <w:b/>
+                <w:color w:val="17324D"/>
+                <w:sz w:val="17"/>
+              </w:rPr>
+              <w:t>운영 기준</w:t>
+            </w:r>
+          </w:p>
+        </w:tc>
+      </w:tr>
+      <w:tr>
+        <w:tc>
+          <w:tcPr>
+            <w:tcW w:type="dxa" w:w="2200"/>
+            <w:tcMar>
+              <w:top w:w="80" w:type="dxa"/>
+              <w:start w:w="110" w:type="dxa"/>
+              <w:bottom w:w="80" w:type="dxa"/>
+              <w:end w:w="110" w:type="dxa"/>
+            </w:tcMar>
+          </w:tcPr>
+          <w:p>
+            <w:pPr>
+              <w:spacing w:after="0"/>
+            </w:pPr>
+            <w:r>
+              <w:rPr>
+                <w:rFonts w:ascii="Arial Unicode MS" w:hAnsi="Arial Unicode MS" w:eastAsia="Arial Unicode MS" w:cs="Arial Unicode MS"/>
+                <w:b w:val="0"/>
+                <w:color w:val="1F2937"/>
+                <w:sz w:val="17"/>
+              </w:rPr>
+              <w:t>모델</w:t>
+            </w:r>
+          </w:p>
+        </w:tc>
+        <w:tc>
+          <w:tcPr>
+            <w:tcW w:type="dxa" w:w="7160"/>
+            <w:tcMar>
+              <w:top w:w="80" w:type="dxa"/>
+              <w:start w:w="110" w:type="dxa"/>
+              <w:bottom w:w="80" w:type="dxa"/>
+              <w:end w:w="110" w:type="dxa"/>
+            </w:tcMar>
+          </w:tcPr>
+          <w:p>
+            <w:pPr>
+              <w:spacing w:after="0"/>
+            </w:pPr>
+            <w:r>
+              <w:rPr>
+                <w:rFonts w:ascii="Arial Unicode MS" w:hAnsi="Arial Unicode MS" w:eastAsia="Arial Unicode MS" w:cs="Arial Unicode MS"/>
+                <w:b w:val="0"/>
+                <w:color w:val="1F2937"/>
+                <w:sz w:val="17"/>
+              </w:rPr>
+              <w:t>gemma-4-12b-it-base-q4_k_m.gguf (Gemma 4 12B, Q4_K_M)</w:t>
+            </w:r>
+          </w:p>
+        </w:tc>
+      </w:tr>
+      <w:tr>
+        <w:tc>
+          <w:tcPr>
+            <w:tcW w:type="dxa" w:w="2200"/>
+            <w:tcMar>
+              <w:top w:w="80" w:type="dxa"/>
+              <w:start w:w="110" w:type="dxa"/>
+              <w:bottom w:w="80" w:type="dxa"/>
+              <w:end w:w="110" w:type="dxa"/>
+            </w:tcMar>
+          </w:tcPr>
+          <w:p>
+            <w:pPr>
+              <w:spacing w:after="0"/>
+            </w:pPr>
+            <w:r>
+              <w:rPr>
+                <w:rFonts w:ascii="Arial Unicode MS" w:hAnsi="Arial Unicode MS" w:eastAsia="Arial Unicode MS" w:cs="Arial Unicode MS"/>
+                <w:b w:val="0"/>
+                <w:color w:val="1F2937"/>
+                <w:sz w:val="17"/>
+              </w:rPr>
+              <w:t>모델 SHA-256</w:t>
+            </w:r>
+          </w:p>
+        </w:tc>
+        <w:tc>
+          <w:tcPr>
+            <w:tcW w:type="dxa" w:w="7160"/>
+            <w:tcMar>
+              <w:top w:w="80" w:type="dxa"/>
+              <w:start w:w="110" w:type="dxa"/>
+              <w:bottom w:w="80" w:type="dxa"/>
+              <w:end w:w="110" w:type="dxa"/>
+            </w:tcMar>
+          </w:tcPr>
+          <w:p>
+            <w:pPr>
+              <w:spacing w:after="0"/>
+            </w:pPr>
+            <w:r>
+              <w:rPr>
+                <w:rFonts w:ascii="Arial Unicode MS" w:hAnsi="Arial Unicode MS" w:eastAsia="Arial Unicode MS" w:cs="Arial Unicode MS"/>
+                <w:b w:val="0"/>
+                <w:color w:val="1F2937"/>
+                <w:sz w:val="17"/>
+              </w:rPr>
+              <w:t>9808e158…d64bf1a4</w:t>
+            </w:r>
+          </w:p>
+        </w:tc>
+      </w:tr>
+      <w:tr>
+        <w:tc>
+          <w:tcPr>
+            <w:tcW w:type="dxa" w:w="2200"/>
+            <w:tcMar>
+              <w:top w:w="80" w:type="dxa"/>
+              <w:start w:w="110" w:type="dxa"/>
+              <w:bottom w:w="80" w:type="dxa"/>
+              <w:end w:w="110" w:type="dxa"/>
+            </w:tcMar>
+          </w:tcPr>
+          <w:p>
+            <w:pPr>
+              <w:spacing w:after="0"/>
+            </w:pPr>
+            <w:r>
+              <w:rPr>
+                <w:rFonts w:ascii="Arial Unicode MS" w:hAnsi="Arial Unicode MS" w:eastAsia="Arial Unicode MS" w:cs="Arial Unicode MS"/>
+                <w:b w:val="0"/>
+                <w:color w:val="1F2937"/>
+                <w:sz w:val="17"/>
+              </w:rPr>
+              <w:t>llama.cpp</w:t>
+            </w:r>
+          </w:p>
+        </w:tc>
+        <w:tc>
+          <w:tcPr>
+            <w:tcW w:type="dxa" w:w="7160"/>
+            <w:tcMar>
+              <w:top w:w="80" w:type="dxa"/>
+              <w:start w:w="110" w:type="dxa"/>
+              <w:bottom w:w="80" w:type="dxa"/>
+              <w:end w:w="110" w:type="dxa"/>
+            </w:tcMar>
+          </w:tcPr>
+          <w:p>
+            <w:pPr>
+              <w:spacing w:after="0"/>
+            </w:pPr>
+            <w:r>
+              <w:rPr>
+                <w:rFonts w:ascii="Arial Unicode MS" w:hAnsi="Arial Unicode MS" w:eastAsia="Arial Unicode MS" w:cs="Arial Unicode MS"/>
+                <w:b w:val="0"/>
+                <w:color w:val="1F2937"/>
+                <w:sz w:val="17"/>
+              </w:rPr>
+              <w:t>build 9776 / commit ac4105d…</w:t>
+            </w:r>
+          </w:p>
+        </w:tc>
+      </w:tr>
+      <w:tr>
+        <w:tc>
+          <w:tcPr>
+            <w:tcW w:type="dxa" w:w="2200"/>
+            <w:tcMar>
+              <w:top w:w="80" w:type="dxa"/>
+              <w:start w:w="110" w:type="dxa"/>
+              <w:bottom w:w="80" w:type="dxa"/>
+              <w:end w:w="110" w:type="dxa"/>
+            </w:tcMar>
+          </w:tcPr>
+          <w:p>
+            <w:pPr>
+              <w:spacing w:after="0"/>
+            </w:pPr>
+            <w:r>
+              <w:rPr>
+                <w:rFonts w:ascii="Arial Unicode MS" w:hAnsi="Arial Unicode MS" w:eastAsia="Arial Unicode MS" w:cs="Arial Unicode MS"/>
+                <w:b w:val="0"/>
+                <w:color w:val="1F2937"/>
+                <w:sz w:val="17"/>
+              </w:rPr>
+              <w:t>실행 옵션</w:t>
+            </w:r>
+          </w:p>
+        </w:tc>
+        <w:tc>
+          <w:tcPr>
+            <w:tcW w:type="dxa" w:w="7160"/>
+            <w:tcMar>
+              <w:top w:w="80" w:type="dxa"/>
+              <w:start w:w="110" w:type="dxa"/>
+              <w:bottom w:w="80" w:type="dxa"/>
+              <w:end w:w="110" w:type="dxa"/>
+            </w:tcMar>
+          </w:tcPr>
+          <w:p>
+            <w:pPr>
+              <w:spacing w:after="0"/>
+            </w:pPr>
+            <w:r>
+              <w:rPr>
+                <w:rFonts w:ascii="Arial Unicode MS" w:hAnsi="Arial Unicode MS" w:eastAsia="Arial Unicode MS" w:cs="Arial Unicode MS"/>
+                <w:b w:val="0"/>
+                <w:color w:val="1F2937"/>
+                <w:sz w:val="17"/>
+              </w:rPr>
+              <w:t>ctx-size 20480, np=5, reasoning-budget 0, GPU offload</w:t>
+            </w:r>
+          </w:p>
+        </w:tc>
+      </w:tr>
+      <w:tr>
+        <w:tc>
+          <w:tcPr>
+            <w:tcW w:type="dxa" w:w="2200"/>
+            <w:tcMar>
+              <w:top w:w="80" w:type="dxa"/>
+              <w:start w:w="110" w:type="dxa"/>
+              <w:bottom w:w="80" w:type="dxa"/>
+              <w:end w:w="110" w:type="dxa"/>
+            </w:tcMar>
+          </w:tcPr>
+          <w:p>
+            <w:pPr>
+              <w:spacing w:after="0"/>
+            </w:pPr>
+            <w:r>
+              <w:rPr>
+                <w:rFonts w:ascii="Arial Unicode MS" w:hAnsi="Arial Unicode MS" w:eastAsia="Arial Unicode MS" w:cs="Arial Unicode MS"/>
+                <w:b w:val="0"/>
+                <w:color w:val="1F2937"/>
+                <w:sz w:val="17"/>
+              </w:rPr>
+              <w:t>금지 옵션</w:t>
+            </w:r>
+          </w:p>
+        </w:tc>
+        <w:tc>
+          <w:tcPr>
+            <w:tcW w:type="dxa" w:w="7160"/>
+            <w:tcMar>
+              <w:top w:w="80" w:type="dxa"/>
+              <w:start w:w="110" w:type="dxa"/>
+              <w:bottom w:w="80" w:type="dxa"/>
+              <w:end w:w="110" w:type="dxa"/>
+            </w:tcMar>
+          </w:tcPr>
+          <w:p>
+            <w:pPr>
+              <w:spacing w:after="0"/>
+            </w:pPr>
+            <w:r>
+              <w:rPr>
+                <w:rFonts w:ascii="Arial Unicode MS" w:hAnsi="Arial Unicode MS" w:eastAsia="Arial Unicode MS" w:cs="Arial Unicode MS"/>
+                <w:b w:val="0"/>
+                <w:color w:val="1F2937"/>
+                <w:sz w:val="17"/>
+              </w:rPr>
+              <w:t>--skip-chat-parsing 사용 금지</w:t>
+            </w:r>
+          </w:p>
+        </w:tc>
+      </w:tr>
+      <w:tr>
+        <w:tc>
+          <w:tcPr>
+            <w:tcW w:type="dxa" w:w="2200"/>
+            <w:tcMar>
+              <w:top w:w="80" w:type="dxa"/>
+              <w:start w:w="110" w:type="dxa"/>
+              <w:bottom w:w="80" w:type="dxa"/>
+              <w:end w:w="110" w:type="dxa"/>
+            </w:tcMar>
+          </w:tcPr>
+          <w:p>
+            <w:pPr>
+              <w:spacing w:after="0"/>
+            </w:pPr>
+            <w:r>
+              <w:rPr>
+                <w:rFonts w:ascii="Arial Unicode MS" w:hAnsi="Arial Unicode MS" w:eastAsia="Arial Unicode MS" w:cs="Arial Unicode MS"/>
+                <w:b w:val="0"/>
+                <w:color w:val="1F2937"/>
+                <w:sz w:val="17"/>
+              </w:rPr>
+              <w:t>벡터 컬렉션</w:t>
+            </w:r>
+          </w:p>
+        </w:tc>
+        <w:tc>
+          <w:tcPr>
+            <w:tcW w:type="dxa" w:w="7160"/>
+            <w:tcMar>
+              <w:top w:w="80" w:type="dxa"/>
+              <w:start w:w="110" w:type="dxa"/>
+              <w:bottom w:w="80" w:type="dxa"/>
+              <w:end w:w="110" w:type="dxa"/>
+            </w:tcMar>
+          </w:tcPr>
+          <w:p>
+            <w:pPr>
+              <w:spacing w:after="0"/>
+            </w:pPr>
+            <w:r>
+              <w:rPr>
+                <w:rFonts w:ascii="Arial Unicode MS" w:hAnsi="Arial Unicode MS" w:eastAsia="Arial Unicode MS" w:cs="Arial Unicode MS"/>
+                <w:b w:val="0"/>
+                <w:color w:val="1F2937"/>
+                <w:sz w:val="17"/>
+              </w:rPr>
+              <w:t>movies_active / characters_verified_v5</w:t>
+            </w:r>
+          </w:p>
+        </w:tc>
+      </w:tr>
+    </w:tbl>
+    <w:p>
+      <w:pPr>
+        <w:pStyle w:val="Heading1"/>
+      </w:pPr>
+      <w:r>
+        <w:rPr>
+          <w:rFonts w:ascii="Arial Unicode MS" w:hAnsi="Arial Unicode MS" w:eastAsia="Arial Unicode MS" w:cs="Arial Unicode MS"/>
+        </w:rPr>
+        <w:t>2. 파이프라인 개선 범위</w:t>
+      </w:r>
+    </w:p>
+    <w:p>
+      <w:pPr>
+        <w:pStyle w:val="ListBullet"/>
+      </w:pPr>
+      <w:r>
+        <w:rPr>
+          <w:rFonts w:ascii="Arial Unicode MS" w:hAnsi="Arial Unicode MS" w:eastAsia="Arial Unicode MS" w:cs="Arial Unicode MS"/>
+          <w:b w:val="0"/>
+          <w:color w:val="1F2937"/>
+          <w:sz w:val="19"/>
+        </w:rPr>
+        <w:t>캐릭터별 프로필·실용문장 fallback과 관계 근거를 분리해 말투 평준화와 근거 없는 관계 단정을 줄였습니다.</w:t>
+      </w:r>
+    </w:p>
+    <w:p>
+      <w:pPr>
+        <w:pStyle w:val="ListBullet"/>
+      </w:pPr>
+      <w:r>
+        <w:rPr>
+          <w:rFonts w:ascii="Arial Unicode MS" w:hAnsi="Arial Unicode MS" w:eastAsia="Arial Unicode MS" w:cs="Arial Unicode MS"/>
+          <w:b w:val="0"/>
+          <w:color w:val="1F2937"/>
+          <w:sz w:val="19"/>
+        </w:rPr>
+        <w:t>비밀·물건·면접·발표 등 다중 턴 문맥과 안전 규칙을 강화하고, 공격적 표현과 상대 의도 단정을 차단했습니다.</w:t>
+      </w:r>
+    </w:p>
+    <w:p>
+      <w:pPr>
+        <w:pStyle w:val="ListBullet"/>
+      </w:pPr>
+      <w:r>
+        <w:rPr>
+          <w:rFonts w:ascii="Arial Unicode MS" w:hAnsi="Arial Unicode MS" w:eastAsia="Arial Unicode MS" w:cs="Arial Unicode MS"/>
+          <w:b w:val="0"/>
+          <w:color w:val="1F2937"/>
+          <w:sz w:val="19"/>
+        </w:rPr>
+        <w:t>영화 추천은 구조화된 카드의 제목·장르·추천 이유만 사용해 설명과 실제 카드의 불일치를 줄였습니다.</w:t>
+      </w:r>
+    </w:p>
+    <w:p>
+      <w:pPr>
+        <w:pStyle w:val="ListBullet"/>
+      </w:pPr>
+      <w:r>
+        <w:rPr>
+          <w:rFonts w:ascii="Arial Unicode MS" w:hAnsi="Arial Unicode MS" w:eastAsia="Arial Unicode MS" w:cs="Arial Unicode MS"/>
+          <w:b w:val="0"/>
+          <w:color w:val="1F2937"/>
+          <w:sz w:val="19"/>
+        </w:rPr>
+        <w:t>명확한 조건 검색은 CrossEncoder 생략 경로를 사용하고, 자연어·복합 검색은 재정렬 경로를 사용합니다.</w:t>
+      </w:r>
+    </w:p>
+    <w:p>
+      <w:pPr>
+        <w:pStyle w:val="ListBullet"/>
+      </w:pPr>
+      <w:r>
+        <w:rPr>
+          <w:rFonts w:ascii="Arial Unicode MS" w:hAnsi="Arial Unicode MS" w:eastAsia="Arial Unicode MS" w:cs="Arial Unicode MS"/>
+          <w:b w:val="0"/>
+          <w:color w:val="1F2937"/>
+          <w:sz w:val="19"/>
+        </w:rPr>
+        <w:t>날짜·국가·장르·평점 등 명시 조건은 검색 단계의 hard filter로 처리하고, 확인할 수 없는 실시간 OTT 정보는 경계를 안내합니다.</w:t>
+      </w:r>
+    </w:p>
+    <w:tbl>
+      <w:tblPr>
+        <w:tblW w:type="dxa" w:w="9360"/>
+        <w:jc w:val="center"/>
+        <w:tblLayout w:type="fixed"/>
+        <w:tblLook w:firstColumn="1" w:firstRow="1" w:lastColumn="0" w:lastRow="0" w:noHBand="0" w:noVBand="1" w:val="04A0"/>
+      </w:tblPr>
+      <w:tblGrid>
+        <w:gridCol w:w="180"/>
+        <w:gridCol w:w="9180"/>
+      </w:tblGrid>
+      <w:tr>
+        <w:tc>
+          <w:tcPr>
+            <w:tcW w:type="dxa" w:w="180"/>
+            <w:vAlign w:val="center"/>
+            <w:shd w:fill="2E74B5"/>
+            <w:tcMar>
+              <w:top w:w="105" w:type="dxa"/>
+              <w:start w:w="125" w:type="dxa"/>
+              <w:bottom w:w="105" w:type="dxa"/>
+              <w:end w:w="125" w:type="dxa"/>
+            </w:tcMar>
+          </w:tcPr>
+          <w:p/>
+        </w:tc>
+        <w:tc>
+          <w:tcPr>
+            <w:tcW w:type="dxa" w:w="9180"/>
+            <w:vAlign w:val="center"/>
+            <w:shd w:fill="EAF2F8"/>
+            <w:tcMar>
+              <w:top w:w="105" w:type="dxa"/>
+              <w:start w:w="125" w:type="dxa"/>
+              <w:bottom w:w="105" w:type="dxa"/>
+              <w:end w:w="125" w:type="dxa"/>
+            </w:tcMar>
+          </w:tcPr>
+          <w:p>
+            <w:pPr>
+              <w:spacing w:after="0"/>
+            </w:pPr>
+            <w:r>
+              <w:rPr>
+                <w:rFonts w:ascii="Arial Unicode MS" w:hAnsi="Arial Unicode MS" w:eastAsia="Arial Unicode MS" w:cs="Arial Unicode MS"/>
+                <w:b/>
+                <w:color w:val="17324D"/>
+                <w:sz w:val="19"/>
+              </w:rPr>
+              <w:t>모델을 다시 학습하기보다 동일 베이스 모델에서 라우팅·검증·fallback·검색 정책을 개선해 품질과 롤백 안정성을 확보했습니다.</w:t>
+            </w:r>
+          </w:p>
+        </w:tc>
+      </w:tr>
+    </w:tbl>
+    <w:p>
+      <w:pPr>
+        <w:spacing w:after="20"/>
+      </w:pPr>
+    </w:p>
+    <w:p>
+      <w:r>
+        <w:rPr>
+          <w:rFonts w:ascii="Arial Unicode MS" w:hAnsi="Arial Unicode MS" w:eastAsia="Arial Unicode MS" w:cs="Arial Unicode MS"/>
+        </w:rPr>
         <w:br w:type="page"/>
       </w:r>
     </w:p>
     <w:p>
       <w:pPr>
-        <w:spacing w:after="0"/>
-        <w:jc w:val="center"/>
+        <w:spacing w:after="100"/>
       </w:pPr>
       <w:r>
-        <w:drawing>
-          <wp:inline xmlns:a="http://schemas.openxmlformats.org/drawingml/2006/main" xmlns:pic="http://schemas.openxmlformats.org/drawingml/2006/picture">
-            <wp:extent cx="7196328" cy="10173452"/>
-            <wp:docPr id="2" name="Picture 2"/>
-            <wp:cNvGraphicFramePr>
-              <a:graphicFrameLocks noChangeAspect="1"/>
-            </wp:cNvGraphicFramePr>
-            <a:graphic>
-              <a:graphicData uri="http://schemas.openxmlformats.org/drawingml/2006/picture">
-                <pic:pic>
-                  <pic:nvPicPr>
-                    <pic:cNvPr id="0" name="page-2.png"/>
-                    <pic:cNvPicPr/>
-                  </pic:nvPicPr>
-                  <pic:blipFill>
-                    <a:blip r:embed="rId10"/>
-                    <a:stretch>
-                      <a:fillRect/>
-                    </a:stretch>
-                  </pic:blipFill>
-                  <pic:spPr>
-                    <a:xfrm>
-                      <a:off x="0" y="0"/>
-                      <a:ext cx="7196328" cy="10173452"/>
-                    </a:xfrm>
-                    <a:prstGeom prst="rect"/>
-                  </pic:spPr>
-                </pic:pic>
-              </a:graphicData>
-            </a:graphic>
-          </wp:inline>
-        </w:drawing>
+        <w:rPr>
+          <w:rFonts w:ascii="Arial Unicode MS" w:hAnsi="Arial Unicode MS" w:eastAsia="Arial Unicode MS" w:cs="Arial Unicode MS"/>
+          <w:b/>
+          <w:caps/>
+          <w:color w:val="F59E0B"/>
+          <w:sz w:val="18"/>
+        </w:rPr>
+        <w:t>VERIFICATION &amp; PRODUCTION RELEASE</w:t>
       </w:r>
     </w:p>
     <w:p>
+      <w:pPr>
+        <w:pStyle w:val="Title"/>
+      </w:pPr>
       <w:r>
+        <w:rPr>
+          <w:rFonts w:ascii="Arial Unicode MS" w:hAnsi="Arial Unicode MS" w:eastAsia="Arial Unicode MS" w:cs="Arial Unicode MS"/>
+        </w:rPr>
+        <w:t>검증 결과와 운영 배포</w:t>
+      </w:r>
+    </w:p>
+    <w:p>
+      <w:pPr>
+        <w:pStyle w:val="Heading1"/>
+      </w:pPr>
+      <w:r>
+        <w:rPr>
+          <w:rFonts w:ascii="Arial Unicode MS" w:hAnsi="Arial Unicode MS" w:eastAsia="Arial Unicode MS" w:cs="Arial Unicode MS"/>
+        </w:rPr>
+        <w:t>1. 누적 품질 검증</w:t>
+      </w:r>
+    </w:p>
+    <w:tbl>
+      <w:tblPr>
+        <w:tblStyle w:val="TableGrid"/>
+        <w:tblW w:type="dxa" w:w="9360"/>
+        <w:jc w:val="center"/>
+        <w:tblLayout w:type="fixed"/>
+        <w:tblLook w:firstColumn="1" w:firstRow="1" w:lastColumn="0" w:lastRow="0" w:noHBand="0" w:noVBand="1" w:val="04A0"/>
+      </w:tblPr>
+      <w:tblGrid>
+        <w:gridCol w:w="5200"/>
+        <w:gridCol w:w="4160"/>
+      </w:tblGrid>
+      <w:tr>
+        <w:trPr>
+          <w:tblHeader w:val="true"/>
+        </w:trPr>
+        <w:tc>
+          <w:tcPr>
+            <w:tcW w:type="dxa" w:w="5200"/>
+            <w:vAlign w:val="center"/>
+            <w:shd w:fill="F2F4F7"/>
+            <w:tcMar>
+              <w:top w:w="80" w:type="dxa"/>
+              <w:start w:w="110" w:type="dxa"/>
+              <w:bottom w:w="80" w:type="dxa"/>
+              <w:end w:w="110" w:type="dxa"/>
+            </w:tcMar>
+          </w:tcPr>
+          <w:p>
+            <w:pPr>
+              <w:spacing w:after="0"/>
+            </w:pPr>
+            <w:r>
+              <w:rPr>
+                <w:rFonts w:ascii="Arial Unicode MS" w:hAnsi="Arial Unicode MS" w:eastAsia="Arial Unicode MS" w:cs="Arial Unicode MS"/>
+                <w:b/>
+                <w:color w:val="17324D"/>
+                <w:sz w:val="17"/>
+              </w:rPr>
+              <w:t>검증</w:t>
+            </w:r>
+          </w:p>
+        </w:tc>
+        <w:tc>
+          <w:tcPr>
+            <w:tcW w:type="dxa" w:w="4160"/>
+            <w:vAlign w:val="center"/>
+            <w:shd w:fill="F2F4F7"/>
+            <w:tcMar>
+              <w:top w:w="80" w:type="dxa"/>
+              <w:start w:w="110" w:type="dxa"/>
+              <w:bottom w:w="80" w:type="dxa"/>
+              <w:end w:w="110" w:type="dxa"/>
+            </w:tcMar>
+          </w:tcPr>
+          <w:p>
+            <w:pPr>
+              <w:spacing w:after="0"/>
+            </w:pPr>
+            <w:r>
+              <w:rPr>
+                <w:rFonts w:ascii="Arial Unicode MS" w:hAnsi="Arial Unicode MS" w:eastAsia="Arial Unicode MS" w:cs="Arial Unicode MS"/>
+                <w:b/>
+                <w:color w:val="17324D"/>
+                <w:sz w:val="17"/>
+              </w:rPr>
+              <w:t>결과</w:t>
+            </w:r>
+          </w:p>
+        </w:tc>
+      </w:tr>
+      <w:tr>
+        <w:tc>
+          <w:tcPr>
+            <w:tcW w:type="dxa" w:w="5200"/>
+            <w:tcMar>
+              <w:top w:w="80" w:type="dxa"/>
+              <w:start w:w="110" w:type="dxa"/>
+              <w:bottom w:w="80" w:type="dxa"/>
+              <w:end w:w="110" w:type="dxa"/>
+            </w:tcMar>
+          </w:tcPr>
+          <w:p>
+            <w:pPr>
+              <w:spacing w:after="0"/>
+            </w:pPr>
+            <w:r>
+              <w:rPr>
+                <w:rFonts w:ascii="Arial Unicode MS" w:hAnsi="Arial Unicode MS" w:eastAsia="Arial Unicode MS" w:cs="Arial Unicode MS"/>
+                <w:b w:val="0"/>
+                <w:color w:val="1F2937"/>
+                <w:sz w:val="17"/>
+              </w:rPr>
+              <w:t>캐릭터 50명 × 3상황 × 3턴</w:t>
+            </w:r>
+          </w:p>
+        </w:tc>
+        <w:tc>
+          <w:tcPr>
+            <w:tcW w:type="dxa" w:w="4160"/>
+            <w:tcMar>
+              <w:top w:w="80" w:type="dxa"/>
+              <w:start w:w="110" w:type="dxa"/>
+              <w:bottom w:w="80" w:type="dxa"/>
+              <w:end w:w="110" w:type="dxa"/>
+            </w:tcMar>
+          </w:tcPr>
+          <w:p>
+            <w:pPr>
+              <w:spacing w:after="0"/>
+            </w:pPr>
+            <w:r>
+              <w:rPr>
+                <w:rFonts w:ascii="Arial Unicode MS" w:hAnsi="Arial Unicode MS" w:eastAsia="Arial Unicode MS" w:cs="Arial Unicode MS"/>
+                <w:b w:val="0"/>
+                <w:color w:val="1F2937"/>
+                <w:sz w:val="17"/>
+              </w:rPr>
+              <w:t>450/450 통과</w:t>
+            </w:r>
+          </w:p>
+        </w:tc>
+      </w:tr>
+      <w:tr>
+        <w:tc>
+          <w:tcPr>
+            <w:tcW w:type="dxa" w:w="5200"/>
+            <w:tcMar>
+              <w:top w:w="80" w:type="dxa"/>
+              <w:start w:w="110" w:type="dxa"/>
+              <w:bottom w:w="80" w:type="dxa"/>
+              <w:end w:w="110" w:type="dxa"/>
+            </w:tcMar>
+          </w:tcPr>
+          <w:p>
+            <w:pPr>
+              <w:spacing w:after="0"/>
+            </w:pPr>
+            <w:r>
+              <w:rPr>
+                <w:rFonts w:ascii="Arial Unicode MS" w:hAnsi="Arial Unicode MS" w:eastAsia="Arial Unicode MS" w:cs="Arial Unicode MS"/>
+                <w:b w:val="0"/>
+                <w:color w:val="1F2937"/>
+                <w:sz w:val="17"/>
+              </w:rPr>
+              <w:t>유사도 0.90 이상 답변</w:t>
+            </w:r>
+          </w:p>
+        </w:tc>
+        <w:tc>
+          <w:tcPr>
+            <w:tcW w:type="dxa" w:w="4160"/>
+            <w:tcMar>
+              <w:top w:w="80" w:type="dxa"/>
+              <w:start w:w="110" w:type="dxa"/>
+              <w:bottom w:w="80" w:type="dxa"/>
+              <w:end w:w="110" w:type="dxa"/>
+            </w:tcMar>
+          </w:tcPr>
+          <w:p>
+            <w:pPr>
+              <w:spacing w:after="0"/>
+            </w:pPr>
+            <w:r>
+              <w:rPr>
+                <w:rFonts w:ascii="Arial Unicode MS" w:hAnsi="Arial Unicode MS" w:eastAsia="Arial Unicode MS" w:cs="Arial Unicode MS"/>
+                <w:b w:val="0"/>
+                <w:color w:val="1F2937"/>
+                <w:sz w:val="17"/>
+              </w:rPr>
+              <w:t>86쌍 → 0쌍</w:t>
+            </w:r>
+          </w:p>
+        </w:tc>
+      </w:tr>
+      <w:tr>
+        <w:tc>
+          <w:tcPr>
+            <w:tcW w:type="dxa" w:w="5200"/>
+            <w:tcMar>
+              <w:top w:w="80" w:type="dxa"/>
+              <w:start w:w="110" w:type="dxa"/>
+              <w:bottom w:w="80" w:type="dxa"/>
+              <w:end w:w="110" w:type="dxa"/>
+            </w:tcMar>
+          </w:tcPr>
+          <w:p>
+            <w:pPr>
+              <w:spacing w:after="0"/>
+            </w:pPr>
+            <w:r>
+              <w:rPr>
+                <w:rFonts w:ascii="Arial Unicode MS" w:hAnsi="Arial Unicode MS" w:eastAsia="Arial Unicode MS" w:cs="Arial Unicode MS"/>
+                <w:b w:val="0"/>
+                <w:color w:val="1F2937"/>
+                <w:sz w:val="17"/>
+              </w:rPr>
+              <w:t>실사용자형 강건성</w:t>
+            </w:r>
+          </w:p>
+        </w:tc>
+        <w:tc>
+          <w:tcPr>
+            <w:tcW w:type="dxa" w:w="4160"/>
+            <w:tcMar>
+              <w:top w:w="80" w:type="dxa"/>
+              <w:start w:w="110" w:type="dxa"/>
+              <w:bottom w:w="80" w:type="dxa"/>
+              <w:end w:w="110" w:type="dxa"/>
+            </w:tcMar>
+          </w:tcPr>
+          <w:p>
+            <w:pPr>
+              <w:spacing w:after="0"/>
+            </w:pPr>
+            <w:r>
+              <w:rPr>
+                <w:rFonts w:ascii="Arial Unicode MS" w:hAnsi="Arial Unicode MS" w:eastAsia="Arial Unicode MS" w:cs="Arial Unicode MS"/>
+                <w:b w:val="0"/>
+                <w:color w:val="1F2937"/>
+                <w:sz w:val="17"/>
+              </w:rPr>
+              <w:t>15/15 통과</w:t>
+            </w:r>
+          </w:p>
+        </w:tc>
+      </w:tr>
+      <w:tr>
+        <w:tc>
+          <w:tcPr>
+            <w:tcW w:type="dxa" w:w="5200"/>
+            <w:tcMar>
+              <w:top w:w="80" w:type="dxa"/>
+              <w:start w:w="110" w:type="dxa"/>
+              <w:bottom w:w="80" w:type="dxa"/>
+              <w:end w:w="110" w:type="dxa"/>
+            </w:tcMar>
+          </w:tcPr>
+          <w:p>
+            <w:pPr>
+              <w:spacing w:after="0"/>
+            </w:pPr>
+            <w:r>
+              <w:rPr>
+                <w:rFonts w:ascii="Arial Unicode MS" w:hAnsi="Arial Unicode MS" w:eastAsia="Arial Unicode MS" w:cs="Arial Unicode MS"/>
+                <w:b w:val="0"/>
+                <w:color w:val="1F2937"/>
+                <w:sz w:val="17"/>
+              </w:rPr>
+              <w:t>배포 전 회귀</w:t>
+            </w:r>
+          </w:p>
+        </w:tc>
+        <w:tc>
+          <w:tcPr>
+            <w:tcW w:type="dxa" w:w="4160"/>
+            <w:tcMar>
+              <w:top w:w="80" w:type="dxa"/>
+              <w:start w:w="110" w:type="dxa"/>
+              <w:bottom w:w="80" w:type="dxa"/>
+              <w:end w:w="110" w:type="dxa"/>
+            </w:tcMar>
+          </w:tcPr>
+          <w:p>
+            <w:pPr>
+              <w:spacing w:after="0"/>
+            </w:pPr>
+            <w:r>
+              <w:rPr>
+                <w:rFonts w:ascii="Arial Unicode MS" w:hAnsi="Arial Unicode MS" w:eastAsia="Arial Unicode MS" w:cs="Arial Unicode MS"/>
+                <w:b w:val="0"/>
+                <w:color w:val="1F2937"/>
+                <w:sz w:val="17"/>
+              </w:rPr>
+              <w:t>255/255 통과</w:t>
+            </w:r>
+          </w:p>
+        </w:tc>
+      </w:tr>
+      <w:tr>
+        <w:tc>
+          <w:tcPr>
+            <w:tcW w:type="dxa" w:w="5200"/>
+            <w:tcMar>
+              <w:top w:w="80" w:type="dxa"/>
+              <w:start w:w="110" w:type="dxa"/>
+              <w:bottom w:w="80" w:type="dxa"/>
+              <w:end w:w="110" w:type="dxa"/>
+            </w:tcMar>
+          </w:tcPr>
+          <w:p>
+            <w:pPr>
+              <w:spacing w:after="0"/>
+            </w:pPr>
+            <w:r>
+              <w:rPr>
+                <w:rFonts w:ascii="Arial Unicode MS" w:hAnsi="Arial Unicode MS" w:eastAsia="Arial Unicode MS" w:cs="Arial Unicode MS"/>
+                <w:b w:val="0"/>
+                <w:color w:val="1F2937"/>
+                <w:sz w:val="17"/>
+              </w:rPr>
+              <w:t>배포 전 실제 API 스모크</w:t>
+            </w:r>
+          </w:p>
+        </w:tc>
+        <w:tc>
+          <w:tcPr>
+            <w:tcW w:type="dxa" w:w="4160"/>
+            <w:tcMar>
+              <w:top w:w="80" w:type="dxa"/>
+              <w:start w:w="110" w:type="dxa"/>
+              <w:bottom w:w="80" w:type="dxa"/>
+              <w:end w:w="110" w:type="dxa"/>
+            </w:tcMar>
+          </w:tcPr>
+          <w:p>
+            <w:pPr>
+              <w:spacing w:after="0"/>
+            </w:pPr>
+            <w:r>
+              <w:rPr>
+                <w:rFonts w:ascii="Arial Unicode MS" w:hAnsi="Arial Unicode MS" w:eastAsia="Arial Unicode MS" w:cs="Arial Unicode MS"/>
+                <w:b w:val="0"/>
+                <w:color w:val="1F2937"/>
+                <w:sz w:val="17"/>
+              </w:rPr>
+              <w:t>7/7 통과 / critical failure 0</w:t>
+            </w:r>
+          </w:p>
+        </w:tc>
+      </w:tr>
+      <w:tr>
+        <w:tc>
+          <w:tcPr>
+            <w:tcW w:type="dxa" w:w="5200"/>
+            <w:tcMar>
+              <w:top w:w="80" w:type="dxa"/>
+              <w:start w:w="110" w:type="dxa"/>
+              <w:bottom w:w="80" w:type="dxa"/>
+              <w:end w:w="110" w:type="dxa"/>
+            </w:tcMar>
+          </w:tcPr>
+          <w:p>
+            <w:pPr>
+              <w:spacing w:after="0"/>
+            </w:pPr>
+            <w:r>
+              <w:rPr>
+                <w:rFonts w:ascii="Arial Unicode MS" w:hAnsi="Arial Unicode MS" w:eastAsia="Arial Unicode MS" w:cs="Arial Unicode MS"/>
+                <w:b w:val="0"/>
+                <w:color w:val="1F2937"/>
+                <w:sz w:val="17"/>
+              </w:rPr>
+              <w:t>최종 로컬 검증</w:t>
+            </w:r>
+          </w:p>
+        </w:tc>
+        <w:tc>
+          <w:tcPr>
+            <w:tcW w:type="dxa" w:w="4160"/>
+            <w:tcMar>
+              <w:top w:w="80" w:type="dxa"/>
+              <w:start w:w="110" w:type="dxa"/>
+              <w:bottom w:w="80" w:type="dxa"/>
+              <w:end w:w="110" w:type="dxa"/>
+            </w:tcMar>
+          </w:tcPr>
+          <w:p>
+            <w:pPr>
+              <w:spacing w:after="0"/>
+            </w:pPr>
+            <w:r>
+              <w:rPr>
+                <w:rFonts w:ascii="Arial Unicode MS" w:hAnsi="Arial Unicode MS" w:eastAsia="Arial Unicode MS" w:cs="Arial Unicode MS"/>
+                <w:b w:val="0"/>
+                <w:color w:val="1F2937"/>
+                <w:sz w:val="17"/>
+              </w:rPr>
+              <w:t>432 tests + 108 subtests 통과</w:t>
+            </w:r>
+          </w:p>
+        </w:tc>
+      </w:tr>
+    </w:tbl>
+    <w:p>
+      <w:pPr>
+        <w:pStyle w:val="Heading1"/>
+      </w:pPr>
+      <w:r>
+        <w:rPr>
+          <w:rFonts w:ascii="Arial Unicode MS" w:hAnsi="Arial Unicode MS" w:eastAsia="Arial Unicode MS" w:cs="Arial Unicode MS"/>
+        </w:rPr>
+        <w:t>2. 2026-08-19 운영 반영</w:t>
+      </w:r>
+    </w:p>
+    <w:p>
+      <w:pPr>
+        <w:pStyle w:val="ListBullet"/>
+      </w:pPr>
+      <w:r>
+        <w:rPr>
+          <w:rFonts w:ascii="Arial Unicode MS" w:hAnsi="Arial Unicode MS" w:eastAsia="Arial Unicode MS" w:cs="Arial Unicode MS"/>
+          <w:b w:val="0"/>
+          <w:color w:val="1F2937"/>
+          <w:sz w:val="19"/>
+        </w:rPr>
+        <w:t>배포 순서: GPU-B(10.30.3.119) → GPU-A(10.30.2.227).</w:t>
+      </w:r>
+    </w:p>
+    <w:p>
+      <w:pPr>
+        <w:pStyle w:val="ListBullet"/>
+      </w:pPr>
+      <w:r>
+        <w:rPr>
+          <w:rFonts w:ascii="Arial Unicode MS" w:hAnsi="Arial Unicode MS" w:eastAsia="Arial Unicode MS" w:cs="Arial Unicode MS"/>
+          <w:b w:val="0"/>
+          <w:color w:val="1F2937"/>
+          <w:sz w:val="19"/>
+        </w:rPr>
+        <w:t>범위: pipeline/, rag/, data/topic_profiles.json 아래 승인된 런타임·데이터 파일 10개.</w:t>
+      </w:r>
+    </w:p>
+    <w:p>
+      <w:pPr>
+        <w:pStyle w:val="ListBullet"/>
+      </w:pPr>
+      <w:r>
+        <w:rPr>
+          <w:rFonts w:ascii="Arial Unicode MS" w:hAnsi="Arial Unicode MS" w:eastAsia="Arial Unicode MS" w:cs="Arial Unicode MS"/>
+          <w:b w:val="0"/>
+          <w:color w:val="1F2937"/>
+          <w:sz w:val="19"/>
+        </w:rPr>
+        <w:t>제외: GGUF, llama-server 옵션, .env, 가상환경, Milvus 데이터, 로그, 테스트 모델.</w:t>
+      </w:r>
+    </w:p>
+    <w:p>
+      <w:pPr>
+        <w:pStyle w:val="ListBullet"/>
+      </w:pPr>
+      <w:r>
+        <w:rPr>
+          <w:rFonts w:ascii="Arial Unicode MS" w:hAnsi="Arial Unicode MS" w:eastAsia="Arial Unicode MS" w:cs="Arial Unicode MS"/>
+          <w:b w:val="0"/>
+          <w:color w:val="1F2937"/>
+          <w:sz w:val="19"/>
+        </w:rPr>
+        <w:t>롤백 사본: 각 노드 /home/ubuntu/cineverse-backups/ai-final-20260819-101047/.</w:t>
+      </w:r>
+    </w:p>
+    <w:p>
+      <w:pPr>
+        <w:pStyle w:val="ListBullet"/>
+      </w:pPr>
+      <w:r>
+        <w:rPr>
+          <w:rFonts w:ascii="Arial Unicode MS" w:hAnsi="Arial Unicode MS" w:eastAsia="Arial Unicode MS" w:cs="Arial Unicode MS"/>
+          <w:b w:val="0"/>
+          <w:color w:val="1F2937"/>
+          <w:sz w:val="19"/>
+        </w:rPr>
+        <w:t>배포 후 두 노드의 SHA-256 일치와 cineverse-api.service health를 확인했습니다.</w:t>
+      </w:r>
+    </w:p>
+    <w:p>
+      <w:pPr>
+        <w:pStyle w:val="Heading1"/>
+      </w:pPr>
+      <w:r>
+        <w:rPr>
+          <w:rFonts w:ascii="Arial Unicode MS" w:hAnsi="Arial Unicode MS" w:eastAsia="Arial Unicode MS" w:cs="Arial Unicode MS"/>
+        </w:rPr>
+        <w:t>3. 운영 스모크</w:t>
+      </w:r>
+    </w:p>
+    <w:tbl>
+      <w:tblPr>
+        <w:tblStyle w:val="TableGrid"/>
+        <w:tblW w:type="dxa" w:w="9360"/>
+        <w:jc w:val="center"/>
+        <w:tblLayout w:type="fixed"/>
+        <w:tblLook w:firstColumn="1" w:firstRow="1" w:lastColumn="0" w:lastRow="0" w:noHBand="0" w:noVBand="1" w:val="04A0"/>
+      </w:tblPr>
+      <w:tblGrid>
+        <w:gridCol w:w="2600"/>
+        <w:gridCol w:w="6760"/>
+      </w:tblGrid>
+      <w:tr>
+        <w:trPr>
+          <w:tblHeader w:val="true"/>
+        </w:trPr>
+        <w:tc>
+          <w:tcPr>
+            <w:tcW w:type="dxa" w:w="2600"/>
+            <w:vAlign w:val="center"/>
+            <w:shd w:fill="F2F4F7"/>
+            <w:tcMar>
+              <w:top w:w="80" w:type="dxa"/>
+              <w:start w:w="110" w:type="dxa"/>
+              <w:bottom w:w="80" w:type="dxa"/>
+              <w:end w:w="110" w:type="dxa"/>
+            </w:tcMar>
+          </w:tcPr>
+          <w:p>
+            <w:pPr>
+              <w:spacing w:after="0"/>
+            </w:pPr>
+            <w:r>
+              <w:rPr>
+                <w:rFonts w:ascii="Arial Unicode MS" w:hAnsi="Arial Unicode MS" w:eastAsia="Arial Unicode MS" w:cs="Arial Unicode MS"/>
+                <w:b/>
+                <w:color w:val="17324D"/>
+                <w:sz w:val="17"/>
+              </w:rPr>
+              <w:t>대상</w:t>
+            </w:r>
+          </w:p>
+        </w:tc>
+        <w:tc>
+          <w:tcPr>
+            <w:tcW w:type="dxa" w:w="6760"/>
+            <w:vAlign w:val="center"/>
+            <w:shd w:fill="F2F4F7"/>
+            <w:tcMar>
+              <w:top w:w="80" w:type="dxa"/>
+              <w:start w:w="110" w:type="dxa"/>
+              <w:bottom w:w="80" w:type="dxa"/>
+              <w:end w:w="110" w:type="dxa"/>
+            </w:tcMar>
+          </w:tcPr>
+          <w:p>
+            <w:pPr>
+              <w:spacing w:after="0"/>
+            </w:pPr>
+            <w:r>
+              <w:rPr>
+                <w:rFonts w:ascii="Arial Unicode MS" w:hAnsi="Arial Unicode MS" w:eastAsia="Arial Unicode MS" w:cs="Arial Unicode MS"/>
+                <w:b/>
+                <w:color w:val="17324D"/>
+                <w:sz w:val="17"/>
+              </w:rPr>
+              <w:t>검증 결과</w:t>
+            </w:r>
+          </w:p>
+        </w:tc>
+      </w:tr>
+      <w:tr>
+        <w:tc>
+          <w:tcPr>
+            <w:tcW w:type="dxa" w:w="2600"/>
+            <w:tcMar>
+              <w:top w:w="80" w:type="dxa"/>
+              <w:start w:w="110" w:type="dxa"/>
+              <w:bottom w:w="80" w:type="dxa"/>
+              <w:end w:w="110" w:type="dxa"/>
+            </w:tcMar>
+          </w:tcPr>
+          <w:p>
+            <w:pPr>
+              <w:spacing w:after="0"/>
+            </w:pPr>
+            <w:r>
+              <w:rPr>
+                <w:rFonts w:ascii="Arial Unicode MS" w:hAnsi="Arial Unicode MS" w:eastAsia="Arial Unicode MS" w:cs="Arial Unicode MS"/>
+                <w:b w:val="0"/>
+                <w:color w:val="1F2937"/>
+                <w:sz w:val="17"/>
+              </w:rPr>
+              <w:t>GPU-A</w:t>
+            </w:r>
+          </w:p>
+        </w:tc>
+        <w:tc>
+          <w:tcPr>
+            <w:tcW w:type="dxa" w:w="6760"/>
+            <w:tcMar>
+              <w:top w:w="80" w:type="dxa"/>
+              <w:start w:w="110" w:type="dxa"/>
+              <w:bottom w:w="80" w:type="dxa"/>
+              <w:end w:w="110" w:type="dxa"/>
+            </w:tcMar>
+          </w:tcPr>
+          <w:p>
+            <w:pPr>
+              <w:spacing w:after="0"/>
+            </w:pPr>
+            <w:r>
+              <w:rPr>
+                <w:rFonts w:ascii="Arial Unicode MS" w:hAnsi="Arial Unicode MS" w:eastAsia="Arial Unicode MS" w:cs="Arial Unicode MS"/>
+                <w:b w:val="0"/>
+                <w:color w:val="1F2937"/>
+                <w:sz w:val="17"/>
+              </w:rPr>
+              <w:t>HTTP 200, 영화 카드 3개, 단일 표본 15.77초</w:t>
+            </w:r>
+          </w:p>
+        </w:tc>
+      </w:tr>
+      <w:tr>
+        <w:tc>
+          <w:tcPr>
+            <w:tcW w:type="dxa" w:w="2600"/>
+            <w:tcMar>
+              <w:top w:w="80" w:type="dxa"/>
+              <w:start w:w="110" w:type="dxa"/>
+              <w:bottom w:w="80" w:type="dxa"/>
+              <w:end w:w="110" w:type="dxa"/>
+            </w:tcMar>
+          </w:tcPr>
+          <w:p>
+            <w:pPr>
+              <w:spacing w:after="0"/>
+            </w:pPr>
+            <w:r>
+              <w:rPr>
+                <w:rFonts w:ascii="Arial Unicode MS" w:hAnsi="Arial Unicode MS" w:eastAsia="Arial Unicode MS" w:cs="Arial Unicode MS"/>
+                <w:b w:val="0"/>
+                <w:color w:val="1F2937"/>
+                <w:sz w:val="17"/>
+              </w:rPr>
+              <w:t>GPU-B</w:t>
+            </w:r>
+          </w:p>
+        </w:tc>
+        <w:tc>
+          <w:tcPr>
+            <w:tcW w:type="dxa" w:w="6760"/>
+            <w:tcMar>
+              <w:top w:w="80" w:type="dxa"/>
+              <w:start w:w="110" w:type="dxa"/>
+              <w:bottom w:w="80" w:type="dxa"/>
+              <w:end w:w="110" w:type="dxa"/>
+            </w:tcMar>
+          </w:tcPr>
+          <w:p>
+            <w:pPr>
+              <w:spacing w:after="0"/>
+            </w:pPr>
+            <w:r>
+              <w:rPr>
+                <w:rFonts w:ascii="Arial Unicode MS" w:hAnsi="Arial Unicode MS" w:eastAsia="Arial Unicode MS" w:cs="Arial Unicode MS"/>
+                <w:b w:val="0"/>
+                <w:color w:val="1F2937"/>
+                <w:sz w:val="17"/>
+              </w:rPr>
+              <w:t>HTTP 200, 영화 카드 3개, 단일 표본 4.87초</w:t>
+            </w:r>
+          </w:p>
+        </w:tc>
+      </w:tr>
+      <w:tr>
+        <w:tc>
+          <w:tcPr>
+            <w:tcW w:type="dxa" w:w="2600"/>
+            <w:tcMar>
+              <w:top w:w="80" w:type="dxa"/>
+              <w:start w:w="110" w:type="dxa"/>
+              <w:bottom w:w="80" w:type="dxa"/>
+              <w:end w:w="110" w:type="dxa"/>
+            </w:tcMar>
+          </w:tcPr>
+          <w:p>
+            <w:pPr>
+              <w:spacing w:after="0"/>
+            </w:pPr>
+            <w:r>
+              <w:rPr>
+                <w:rFonts w:ascii="Arial Unicode MS" w:hAnsi="Arial Unicode MS" w:eastAsia="Arial Unicode MS" w:cs="Arial Unicode MS"/>
+                <w:b w:val="0"/>
+                <w:color w:val="1F2937"/>
+                <w:sz w:val="17"/>
+              </w:rPr>
+              <w:t>Internal AI HA</w:t>
+            </w:r>
+          </w:p>
+        </w:tc>
+        <w:tc>
+          <w:tcPr>
+            <w:tcW w:type="dxa" w:w="6760"/>
+            <w:tcMar>
+              <w:top w:w="80" w:type="dxa"/>
+              <w:start w:w="110" w:type="dxa"/>
+              <w:bottom w:w="80" w:type="dxa"/>
+              <w:end w:w="110" w:type="dxa"/>
+            </w:tcMar>
+          </w:tcPr>
+          <w:p>
+            <w:pPr>
+              <w:spacing w:after="0"/>
+            </w:pPr>
+            <w:r>
+              <w:rPr>
+                <w:rFonts w:ascii="Arial Unicode MS" w:hAnsi="Arial Unicode MS" w:eastAsia="Arial Unicode MS" w:cs="Arial Unicode MS"/>
+                <w:b w:val="0"/>
+                <w:color w:val="1F2937"/>
+                <w:sz w:val="17"/>
+              </w:rPr>
+              <w:t>health 0.169초 / 추천 11.87초 / 카드 3개</w:t>
+            </w:r>
+          </w:p>
+        </w:tc>
+      </w:tr>
+    </w:tbl>
+    <w:tbl>
+      <w:tblPr>
+        <w:tblW w:type="dxa" w:w="9360"/>
+        <w:jc w:val="center"/>
+        <w:tblLayout w:type="fixed"/>
+        <w:tblLook w:firstColumn="1" w:firstRow="1" w:lastColumn="0" w:lastRow="0" w:noHBand="0" w:noVBand="1" w:val="04A0"/>
+      </w:tblPr>
+      <w:tblGrid>
+        <w:gridCol w:w="180"/>
+        <w:gridCol w:w="9180"/>
+      </w:tblGrid>
+      <w:tr>
+        <w:tc>
+          <w:tcPr>
+            <w:tcW w:type="dxa" w:w="180"/>
+            <w:vAlign w:val="center"/>
+            <w:shd w:fill="F59E0B"/>
+            <w:tcMar>
+              <w:top w:w="105" w:type="dxa"/>
+              <w:start w:w="125" w:type="dxa"/>
+              <w:bottom w:w="105" w:type="dxa"/>
+              <w:end w:w="125" w:type="dxa"/>
+            </w:tcMar>
+          </w:tcPr>
+          <w:p/>
+        </w:tc>
+        <w:tc>
+          <w:tcPr>
+            <w:tcW w:type="dxa" w:w="9180"/>
+            <w:vAlign w:val="center"/>
+            <w:shd w:fill="FFF4E0"/>
+            <w:tcMar>
+              <w:top w:w="105" w:type="dxa"/>
+              <w:start w:w="125" w:type="dxa"/>
+              <w:bottom w:w="105" w:type="dxa"/>
+              <w:end w:w="125" w:type="dxa"/>
+            </w:tcMar>
+          </w:tcPr>
+          <w:p>
+            <w:pPr>
+              <w:spacing w:after="0"/>
+            </w:pPr>
+            <w:r>
+              <w:rPr>
+                <w:rFonts w:ascii="Arial Unicode MS" w:hAnsi="Arial Unicode MS" w:eastAsia="Arial Unicode MS" w:cs="Arial Unicode MS"/>
+                <w:b/>
+                <w:color w:val="17324D"/>
+                <w:sz w:val="19"/>
+              </w:rPr>
+              <w:t>GPU-A/B 시간은 각각 한 번의 배포 확인 표본이며 성능 우열을 단정하는 벤치마크가 아닙니다.</w:t>
+            </w:r>
+          </w:p>
+        </w:tc>
+      </w:tr>
+    </w:tbl>
+    <w:p>
+      <w:pPr>
+        <w:spacing w:after="20"/>
+      </w:pPr>
+    </w:p>
+    <w:p>
+      <w:r>
+        <w:rPr>
+          <w:rFonts w:ascii="Arial Unicode MS" w:hAnsi="Arial Unicode MS" w:eastAsia="Arial Unicode MS" w:cs="Arial Unicode MS"/>
+        </w:rPr>
         <w:br w:type="page"/>
       </w:r>
     </w:p>
     <w:p>
       <w:pPr>
-        <w:spacing w:after="0"/>
-        <w:jc w:val="center"/>
+        <w:spacing w:after="100"/>
       </w:pPr>
       <w:r>
-        <w:drawing>
-          <wp:inline xmlns:a="http://schemas.openxmlformats.org/drawingml/2006/main" xmlns:pic="http://schemas.openxmlformats.org/drawingml/2006/picture">
-            <wp:extent cx="7196328" cy="10173452"/>
-            <wp:docPr id="3" name="Picture 3"/>
-            <wp:cNvGraphicFramePr>
-              <a:graphicFrameLocks noChangeAspect="1"/>
-            </wp:cNvGraphicFramePr>
-            <a:graphic>
-              <a:graphicData uri="http://schemas.openxmlformats.org/drawingml/2006/picture">
-                <pic:pic>
-                  <pic:nvPicPr>
-                    <pic:cNvPr id="0" name="page-3.png"/>
-                    <pic:cNvPicPr/>
-                  </pic:nvPicPr>
-                  <pic:blipFill>
-                    <a:blip r:embed="rId11"/>
-                    <a:stretch>
-                      <a:fillRect/>
-                    </a:stretch>
-                  </pic:blipFill>
-                  <pic:spPr>
-                    <a:xfrm>
-                      <a:off x="0" y="0"/>
-                      <a:ext cx="7196328" cy="10173452"/>
-                    </a:xfrm>
-                    <a:prstGeom prst="rect"/>
-                  </pic:spPr>
-                </pic:pic>
-              </a:graphicData>
-            </a:graphic>
-          </wp:inline>
-        </w:drawing>
+        <w:rPr>
+          <w:rFonts w:ascii="Arial Unicode MS" w:hAnsi="Arial Unicode MS" w:eastAsia="Arial Unicode MS" w:cs="Arial Unicode MS"/>
+          <w:b/>
+          <w:caps/>
+          <w:color w:val="F59E0B"/>
+          <w:sz w:val="18"/>
+        </w:rPr>
+        <w:t>PERFORMANCE &amp; OPERATING BOUNDARIES</w:t>
       </w:r>
     </w:p>
+    <w:p>
+      <w:pPr>
+        <w:pStyle w:val="Title"/>
+      </w:pPr>
+      <w:r>
+        <w:rPr>
+          <w:rFonts w:ascii="Arial Unicode MS" w:hAnsi="Arial Unicode MS" w:eastAsia="Arial Unicode MS" w:cs="Arial Unicode MS"/>
+        </w:rPr>
+        <w:t>성능과 운영 경계</w:t>
+      </w:r>
+    </w:p>
+    <w:p>
+      <w:pPr>
+        <w:pStyle w:val="Heading1"/>
+      </w:pPr>
+      <w:r>
+        <w:rPr>
+          <w:rFonts w:ascii="Arial Unicode MS" w:hAnsi="Arial Unicode MS" w:eastAsia="Arial Unicode MS" w:cs="Arial Unicode MS"/>
+        </w:rPr>
+        <w:t>1. 확인된 성능 개선</w:t>
+      </w:r>
+    </w:p>
+    <w:tbl>
+      <w:tblPr>
+        <w:tblStyle w:val="TableGrid"/>
+        <w:tblW w:type="dxa" w:w="9360"/>
+        <w:jc w:val="center"/>
+        <w:tblLayout w:type="fixed"/>
+        <w:tblLook w:firstColumn="1" w:firstRow="1" w:lastColumn="0" w:lastRow="0" w:noHBand="0" w:noVBand="1" w:val="04A0"/>
+      </w:tblPr>
+      <w:tblGrid>
+        <w:gridCol w:w="2500"/>
+        <w:gridCol w:w="1900"/>
+        <w:gridCol w:w="1900"/>
+        <w:gridCol w:w="3060"/>
+      </w:tblGrid>
+      <w:tr>
+        <w:trPr>
+          <w:tblHeader w:val="true"/>
+        </w:trPr>
+        <w:tc>
+          <w:tcPr>
+            <w:tcW w:type="dxa" w:w="2500"/>
+            <w:vAlign w:val="center"/>
+            <w:shd w:fill="F2F4F7"/>
+            <w:tcMar>
+              <w:top w:w="80" w:type="dxa"/>
+              <w:start w:w="110" w:type="dxa"/>
+              <w:bottom w:w="80" w:type="dxa"/>
+              <w:end w:w="110" w:type="dxa"/>
+            </w:tcMar>
+          </w:tcPr>
+          <w:p>
+            <w:pPr>
+              <w:spacing w:after="0"/>
+            </w:pPr>
+            <w:r>
+              <w:rPr>
+                <w:rFonts w:ascii="Arial Unicode MS" w:hAnsi="Arial Unicode MS" w:eastAsia="Arial Unicode MS" w:cs="Arial Unicode MS"/>
+                <w:b/>
+                <w:color w:val="17324D"/>
+                <w:sz w:val="17"/>
+              </w:rPr>
+              <w:t>지표</w:t>
+            </w:r>
+          </w:p>
+        </w:tc>
+        <w:tc>
+          <w:tcPr>
+            <w:tcW w:type="dxa" w:w="1900"/>
+            <w:vAlign w:val="center"/>
+            <w:shd w:fill="F2F4F7"/>
+            <w:tcMar>
+              <w:top w:w="80" w:type="dxa"/>
+              <w:start w:w="110" w:type="dxa"/>
+              <w:bottom w:w="80" w:type="dxa"/>
+              <w:end w:w="110" w:type="dxa"/>
+            </w:tcMar>
+          </w:tcPr>
+          <w:p>
+            <w:pPr>
+              <w:spacing w:after="0"/>
+            </w:pPr>
+            <w:r>
+              <w:rPr>
+                <w:rFonts w:ascii="Arial Unicode MS" w:hAnsi="Arial Unicode MS" w:eastAsia="Arial Unicode MS" w:cs="Arial Unicode MS"/>
+                <w:b/>
+                <w:color w:val="17324D"/>
+                <w:sz w:val="17"/>
+              </w:rPr>
+              <w:t>변경 전</w:t>
+            </w:r>
+          </w:p>
+        </w:tc>
+        <w:tc>
+          <w:tcPr>
+            <w:tcW w:type="dxa" w:w="1900"/>
+            <w:vAlign w:val="center"/>
+            <w:shd w:fill="F2F4F7"/>
+            <w:tcMar>
+              <w:top w:w="80" w:type="dxa"/>
+              <w:start w:w="110" w:type="dxa"/>
+              <w:bottom w:w="80" w:type="dxa"/>
+              <w:end w:w="110" w:type="dxa"/>
+            </w:tcMar>
+          </w:tcPr>
+          <w:p>
+            <w:pPr>
+              <w:spacing w:after="0"/>
+            </w:pPr>
+            <w:r>
+              <w:rPr>
+                <w:rFonts w:ascii="Arial Unicode MS" w:hAnsi="Arial Unicode MS" w:eastAsia="Arial Unicode MS" w:cs="Arial Unicode MS"/>
+                <w:b/>
+                <w:color w:val="17324D"/>
+                <w:sz w:val="17"/>
+              </w:rPr>
+              <w:t>변경 후</w:t>
+            </w:r>
+          </w:p>
+        </w:tc>
+        <w:tc>
+          <w:tcPr>
+            <w:tcW w:type="dxa" w:w="3060"/>
+            <w:vAlign w:val="center"/>
+            <w:shd w:fill="F2F4F7"/>
+            <w:tcMar>
+              <w:top w:w="80" w:type="dxa"/>
+              <w:start w:w="110" w:type="dxa"/>
+              <w:bottom w:w="80" w:type="dxa"/>
+              <w:end w:w="110" w:type="dxa"/>
+            </w:tcMar>
+          </w:tcPr>
+          <w:p>
+            <w:pPr>
+              <w:spacing w:after="0"/>
+            </w:pPr>
+            <w:r>
+              <w:rPr>
+                <w:rFonts w:ascii="Arial Unicode MS" w:hAnsi="Arial Unicode MS" w:eastAsia="Arial Unicode MS" w:cs="Arial Unicode MS"/>
+                <w:b/>
+                <w:color w:val="17324D"/>
+                <w:sz w:val="17"/>
+              </w:rPr>
+              <w:t>개선</w:t>
+            </w:r>
+          </w:p>
+        </w:tc>
+      </w:tr>
+      <w:tr>
+        <w:tc>
+          <w:tcPr>
+            <w:tcW w:type="dxa" w:w="2500"/>
+            <w:tcMar>
+              <w:top w:w="80" w:type="dxa"/>
+              <w:start w:w="110" w:type="dxa"/>
+              <w:bottom w:w="80" w:type="dxa"/>
+              <w:end w:w="110" w:type="dxa"/>
+            </w:tcMar>
+          </w:tcPr>
+          <w:p>
+            <w:pPr>
+              <w:spacing w:after="0"/>
+            </w:pPr>
+            <w:r>
+              <w:rPr>
+                <w:rFonts w:ascii="Arial Unicode MS" w:hAnsi="Arial Unicode MS" w:eastAsia="Arial Unicode MS" w:cs="Arial Unicode MS"/>
+                <w:b w:val="0"/>
+                <w:color w:val="1F2937"/>
+                <w:sz w:val="17"/>
+              </w:rPr>
+              <w:t>단일 추천</w:t>
+            </w:r>
+          </w:p>
+        </w:tc>
+        <w:tc>
+          <w:tcPr>
+            <w:tcW w:type="dxa" w:w="1900"/>
+            <w:tcMar>
+              <w:top w:w="80" w:type="dxa"/>
+              <w:start w:w="110" w:type="dxa"/>
+              <w:bottom w:w="80" w:type="dxa"/>
+              <w:end w:w="110" w:type="dxa"/>
+            </w:tcMar>
+          </w:tcPr>
+          <w:p>
+            <w:pPr>
+              <w:spacing w:after="0"/>
+            </w:pPr>
+            <w:r>
+              <w:rPr>
+                <w:rFonts w:ascii="Arial Unicode MS" w:hAnsi="Arial Unicode MS" w:eastAsia="Arial Unicode MS" w:cs="Arial Unicode MS"/>
+                <w:b w:val="0"/>
+                <w:color w:val="1F2937"/>
+                <w:sz w:val="17"/>
+              </w:rPr>
+              <w:t>7.719초</w:t>
+            </w:r>
+          </w:p>
+        </w:tc>
+        <w:tc>
+          <w:tcPr>
+            <w:tcW w:type="dxa" w:w="1900"/>
+            <w:tcMar>
+              <w:top w:w="80" w:type="dxa"/>
+              <w:start w:w="110" w:type="dxa"/>
+              <w:bottom w:w="80" w:type="dxa"/>
+              <w:end w:w="110" w:type="dxa"/>
+            </w:tcMar>
+          </w:tcPr>
+          <w:p>
+            <w:pPr>
+              <w:spacing w:after="0"/>
+            </w:pPr>
+            <w:r>
+              <w:rPr>
+                <w:rFonts w:ascii="Arial Unicode MS" w:hAnsi="Arial Unicode MS" w:eastAsia="Arial Unicode MS" w:cs="Arial Unicode MS"/>
+                <w:b w:val="0"/>
+                <w:color w:val="1F2937"/>
+                <w:sz w:val="17"/>
+              </w:rPr>
+              <w:t>6.494초</w:t>
+            </w:r>
+          </w:p>
+        </w:tc>
+        <w:tc>
+          <w:tcPr>
+            <w:tcW w:type="dxa" w:w="3060"/>
+            <w:tcMar>
+              <w:top w:w="80" w:type="dxa"/>
+              <w:start w:w="110" w:type="dxa"/>
+              <w:bottom w:w="80" w:type="dxa"/>
+              <w:end w:w="110" w:type="dxa"/>
+            </w:tcMar>
+          </w:tcPr>
+          <w:p>
+            <w:pPr>
+              <w:spacing w:after="0"/>
+            </w:pPr>
+            <w:r>
+              <w:rPr>
+                <w:rFonts w:ascii="Arial Unicode MS" w:hAnsi="Arial Unicode MS" w:eastAsia="Arial Unicode MS" w:cs="Arial Unicode MS"/>
+                <w:b w:val="0"/>
+                <w:color w:val="1F2937"/>
+                <w:sz w:val="17"/>
+              </w:rPr>
+              <w:t>15.9%</w:t>
+            </w:r>
+          </w:p>
+        </w:tc>
+      </w:tr>
+      <w:tr>
+        <w:tc>
+          <w:tcPr>
+            <w:tcW w:type="dxa" w:w="2500"/>
+            <w:tcMar>
+              <w:top w:w="80" w:type="dxa"/>
+              <w:start w:w="110" w:type="dxa"/>
+              <w:bottom w:w="80" w:type="dxa"/>
+              <w:end w:w="110" w:type="dxa"/>
+            </w:tcMar>
+          </w:tcPr>
+          <w:p>
+            <w:pPr>
+              <w:spacing w:after="0"/>
+            </w:pPr>
+            <w:r>
+              <w:rPr>
+                <w:rFonts w:ascii="Arial Unicode MS" w:hAnsi="Arial Unicode MS" w:eastAsia="Arial Unicode MS" w:cs="Arial Unicode MS"/>
+                <w:b w:val="0"/>
+                <w:color w:val="1F2937"/>
+                <w:sz w:val="17"/>
+              </w:rPr>
+              <w:t>5개 동시 요청 p95</w:t>
+            </w:r>
+          </w:p>
+        </w:tc>
+        <w:tc>
+          <w:tcPr>
+            <w:tcW w:type="dxa" w:w="1900"/>
+            <w:tcMar>
+              <w:top w:w="80" w:type="dxa"/>
+              <w:start w:w="110" w:type="dxa"/>
+              <w:bottom w:w="80" w:type="dxa"/>
+              <w:end w:w="110" w:type="dxa"/>
+            </w:tcMar>
+          </w:tcPr>
+          <w:p>
+            <w:pPr>
+              <w:spacing w:after="0"/>
+            </w:pPr>
+            <w:r>
+              <w:rPr>
+                <w:rFonts w:ascii="Arial Unicode MS" w:hAnsi="Arial Unicode MS" w:eastAsia="Arial Unicode MS" w:cs="Arial Unicode MS"/>
+                <w:b w:val="0"/>
+                <w:color w:val="1F2937"/>
+                <w:sz w:val="17"/>
+              </w:rPr>
+              <w:t>21.555초</w:t>
+            </w:r>
+          </w:p>
+        </w:tc>
+        <w:tc>
+          <w:tcPr>
+            <w:tcW w:type="dxa" w:w="1900"/>
+            <w:tcMar>
+              <w:top w:w="80" w:type="dxa"/>
+              <w:start w:w="110" w:type="dxa"/>
+              <w:bottom w:w="80" w:type="dxa"/>
+              <w:end w:w="110" w:type="dxa"/>
+            </w:tcMar>
+          </w:tcPr>
+          <w:p>
+            <w:pPr>
+              <w:spacing w:after="0"/>
+            </w:pPr>
+            <w:r>
+              <w:rPr>
+                <w:rFonts w:ascii="Arial Unicode MS" w:hAnsi="Arial Unicode MS" w:eastAsia="Arial Unicode MS" w:cs="Arial Unicode MS"/>
+                <w:b w:val="0"/>
+                <w:color w:val="1F2937"/>
+                <w:sz w:val="17"/>
+              </w:rPr>
+              <w:t>19.103초</w:t>
+            </w:r>
+          </w:p>
+        </w:tc>
+        <w:tc>
+          <w:tcPr>
+            <w:tcW w:type="dxa" w:w="3060"/>
+            <w:tcMar>
+              <w:top w:w="80" w:type="dxa"/>
+              <w:start w:w="110" w:type="dxa"/>
+              <w:bottom w:w="80" w:type="dxa"/>
+              <w:end w:w="110" w:type="dxa"/>
+            </w:tcMar>
+          </w:tcPr>
+          <w:p>
+            <w:pPr>
+              <w:spacing w:after="0"/>
+            </w:pPr>
+            <w:r>
+              <w:rPr>
+                <w:rFonts w:ascii="Arial Unicode MS" w:hAnsi="Arial Unicode MS" w:eastAsia="Arial Unicode MS" w:cs="Arial Unicode MS"/>
+                <w:b w:val="0"/>
+                <w:color w:val="1F2937"/>
+                <w:sz w:val="17"/>
+              </w:rPr>
+              <w:t>11.4%</w:t>
+            </w:r>
+          </w:p>
+        </w:tc>
+      </w:tr>
+      <w:tr>
+        <w:tc>
+          <w:tcPr>
+            <w:tcW w:type="dxa" w:w="2500"/>
+            <w:tcMar>
+              <w:top w:w="80" w:type="dxa"/>
+              <w:start w:w="110" w:type="dxa"/>
+              <w:bottom w:w="80" w:type="dxa"/>
+              <w:end w:w="110" w:type="dxa"/>
+            </w:tcMar>
+          </w:tcPr>
+          <w:p>
+            <w:pPr>
+              <w:spacing w:after="0"/>
+            </w:pPr>
+            <w:r>
+              <w:rPr>
+                <w:rFonts w:ascii="Arial Unicode MS" w:hAnsi="Arial Unicode MS" w:eastAsia="Arial Unicode MS" w:cs="Arial Unicode MS"/>
+                <w:b w:val="0"/>
+                <w:color w:val="1F2937"/>
+                <w:sz w:val="17"/>
+              </w:rPr>
+              <w:t>조건 검색 생략 경로</w:t>
+            </w:r>
+          </w:p>
+        </w:tc>
+        <w:tc>
+          <w:tcPr>
+            <w:tcW w:type="dxa" w:w="1900"/>
+            <w:tcMar>
+              <w:top w:w="80" w:type="dxa"/>
+              <w:start w:w="110" w:type="dxa"/>
+              <w:bottom w:w="80" w:type="dxa"/>
+              <w:end w:w="110" w:type="dxa"/>
+            </w:tcMar>
+          </w:tcPr>
+          <w:p>
+            <w:pPr>
+              <w:spacing w:after="0"/>
+            </w:pPr>
+            <w:r>
+              <w:rPr>
+                <w:rFonts w:ascii="Arial Unicode MS" w:hAnsi="Arial Unicode MS" w:eastAsia="Arial Unicode MS" w:cs="Arial Unicode MS"/>
+                <w:b w:val="0"/>
+                <w:color w:val="1F2937"/>
+                <w:sz w:val="17"/>
+              </w:rPr>
+              <w:t>-</w:t>
+            </w:r>
+          </w:p>
+        </w:tc>
+        <w:tc>
+          <w:tcPr>
+            <w:tcW w:type="dxa" w:w="1900"/>
+            <w:tcMar>
+              <w:top w:w="80" w:type="dxa"/>
+              <w:start w:w="110" w:type="dxa"/>
+              <w:bottom w:w="80" w:type="dxa"/>
+              <w:end w:w="110" w:type="dxa"/>
+            </w:tcMar>
+          </w:tcPr>
+          <w:p>
+            <w:pPr>
+              <w:spacing w:after="0"/>
+            </w:pPr>
+            <w:r>
+              <w:rPr>
+                <w:rFonts w:ascii="Arial Unicode MS" w:hAnsi="Arial Unicode MS" w:eastAsia="Arial Unicode MS" w:cs="Arial Unicode MS"/>
+                <w:b w:val="0"/>
+                <w:color w:val="1F2937"/>
+                <w:sz w:val="17"/>
+              </w:rPr>
+              <w:t>0.273초</w:t>
+            </w:r>
+          </w:p>
+        </w:tc>
+        <w:tc>
+          <w:tcPr>
+            <w:tcW w:type="dxa" w:w="3060"/>
+            <w:tcMar>
+              <w:top w:w="80" w:type="dxa"/>
+              <w:start w:w="110" w:type="dxa"/>
+              <w:bottom w:w="80" w:type="dxa"/>
+              <w:end w:w="110" w:type="dxa"/>
+            </w:tcMar>
+          </w:tcPr>
+          <w:p>
+            <w:pPr>
+              <w:spacing w:after="0"/>
+            </w:pPr>
+            <w:r>
+              <w:rPr>
+                <w:rFonts w:ascii="Arial Unicode MS" w:hAnsi="Arial Unicode MS" w:eastAsia="Arial Unicode MS" w:cs="Arial Unicode MS"/>
+                <w:b w:val="0"/>
+                <w:color w:val="1F2937"/>
+                <w:sz w:val="17"/>
+              </w:rPr>
+              <w:t>CrossEncoder 생략</w:t>
+            </w:r>
+          </w:p>
+        </w:tc>
+      </w:tr>
+    </w:tbl>
+    <w:p>
+      <w:pPr>
+        <w:pStyle w:val="Heading1"/>
+      </w:pPr>
+      <w:r>
+        <w:rPr>
+          <w:rFonts w:ascii="Arial Unicode MS" w:hAnsi="Arial Unicode MS" w:eastAsia="Arial Unicode MS" w:cs="Arial Unicode MS"/>
+        </w:rPr>
+        <w:t>2. 현재 한계</w:t>
+      </w:r>
+    </w:p>
+    <w:p>
+      <w:pPr>
+        <w:pStyle w:val="ListBullet"/>
+      </w:pPr>
+      <w:r>
+        <w:rPr>
+          <w:rFonts w:ascii="Arial Unicode MS" w:hAnsi="Arial Unicode MS" w:eastAsia="Arial Unicode MS" w:cs="Arial Unicode MS"/>
+          <w:b w:val="0"/>
+          <w:color w:val="1F2937"/>
+          <w:sz w:val="19"/>
+        </w:rPr>
+        <w:t>단일 T4 노드에서 동시 생성 시 요청별 token/s가 5.27~9.33까지 낮아진 측정 이력이 있습니다.</w:t>
+      </w:r>
+    </w:p>
+    <w:p>
+      <w:pPr>
+        <w:pStyle w:val="ListBullet"/>
+      </w:pPr>
+      <w:r>
+        <w:rPr>
+          <w:rFonts w:ascii="Arial Unicode MS" w:hAnsi="Arial Unicode MS" w:eastAsia="Arial Unicode MS" w:cs="Arial Unicode MS"/>
+          <w:b w:val="0"/>
+          <w:color w:val="1F2937"/>
+          <w:sz w:val="19"/>
+        </w:rPr>
+        <w:t>10개 동시 추천 요청 p95는 41.520초였고, 20개 이상에서는 admission 한도에 따라 429/503이 발생했습니다.</w:t>
+      </w:r>
+    </w:p>
+    <w:p>
+      <w:pPr>
+        <w:pStyle w:val="ListBullet"/>
+      </w:pPr>
+      <w:r>
+        <w:rPr>
+          <w:rFonts w:ascii="Arial Unicode MS" w:hAnsi="Arial Unicode MS" w:eastAsia="Arial Unicode MS" w:cs="Arial Unicode MS"/>
+          <w:b w:val="0"/>
+          <w:color w:val="1F2937"/>
+          <w:sz w:val="19"/>
+        </w:rPr>
+        <w:t>캐릭터 원작 지식은 검증된 내부 데이터 범위까지만 답할 수 있습니다.</w:t>
+      </w:r>
+    </w:p>
+    <w:p>
+      <w:pPr>
+        <w:pStyle w:val="ListBullet"/>
+      </w:pPr>
+      <w:r>
+        <w:rPr>
+          <w:rFonts w:ascii="Arial Unicode MS" w:hAnsi="Arial Unicode MS" w:eastAsia="Arial Unicode MS" w:cs="Arial Unicode MS"/>
+          <w:b w:val="0"/>
+          <w:color w:val="1F2937"/>
+          <w:sz w:val="19"/>
+        </w:rPr>
+        <w:t>실시간 OTT 제공 여부는 현재 컬렉션에 지역·시점별 근거가 없어 확정 답변하지 않습니다.</w:t>
+      </w:r>
+    </w:p>
+    <w:p>
+      <w:pPr>
+        <w:pStyle w:val="Heading1"/>
+      </w:pPr>
+      <w:r>
+        <w:rPr>
+          <w:rFonts w:ascii="Arial Unicode MS" w:hAnsi="Arial Unicode MS" w:eastAsia="Arial Unicode MS" w:cs="Arial Unicode MS"/>
+        </w:rPr>
+        <w:t>3. 남은 운영 확인</w:t>
+      </w:r>
+    </w:p>
+    <w:tbl>
+      <w:tblPr>
+        <w:tblStyle w:val="TableGrid"/>
+        <w:tblW w:type="dxa" w:w="9360"/>
+        <w:jc w:val="center"/>
+        <w:tblLayout w:type="fixed"/>
+        <w:tblLook w:firstColumn="1" w:firstRow="1" w:lastColumn="0" w:lastRow="0" w:noHBand="0" w:noVBand="1" w:val="04A0"/>
+      </w:tblPr>
+      <w:tblGrid>
+        <w:gridCol w:w="3400"/>
+        <w:gridCol w:w="5960"/>
+      </w:tblGrid>
+      <w:tr>
+        <w:trPr>
+          <w:tblHeader w:val="true"/>
+        </w:trPr>
+        <w:tc>
+          <w:tcPr>
+            <w:tcW w:type="dxa" w:w="3400"/>
+            <w:vAlign w:val="center"/>
+            <w:shd w:fill="F2F4F7"/>
+            <w:tcMar>
+              <w:top w:w="80" w:type="dxa"/>
+              <w:start w:w="110" w:type="dxa"/>
+              <w:bottom w:w="80" w:type="dxa"/>
+              <w:end w:w="110" w:type="dxa"/>
+            </w:tcMar>
+          </w:tcPr>
+          <w:p>
+            <w:pPr>
+              <w:spacing w:after="0"/>
+            </w:pPr>
+            <w:r>
+              <w:rPr>
+                <w:rFonts w:ascii="Arial Unicode MS" w:hAnsi="Arial Unicode MS" w:eastAsia="Arial Unicode MS" w:cs="Arial Unicode MS"/>
+                <w:b/>
+                <w:color w:val="17324D"/>
+                <w:sz w:val="17"/>
+              </w:rPr>
+              <w:t>항목</w:t>
+            </w:r>
+          </w:p>
+        </w:tc>
+        <w:tc>
+          <w:tcPr>
+            <w:tcW w:type="dxa" w:w="5960"/>
+            <w:vAlign w:val="center"/>
+            <w:shd w:fill="F2F4F7"/>
+            <w:tcMar>
+              <w:top w:w="80" w:type="dxa"/>
+              <w:start w:w="110" w:type="dxa"/>
+              <w:bottom w:w="80" w:type="dxa"/>
+              <w:end w:w="110" w:type="dxa"/>
+            </w:tcMar>
+          </w:tcPr>
+          <w:p>
+            <w:pPr>
+              <w:spacing w:after="0"/>
+            </w:pPr>
+            <w:r>
+              <w:rPr>
+                <w:rFonts w:ascii="Arial Unicode MS" w:hAnsi="Arial Unicode MS" w:eastAsia="Arial Unicode MS" w:cs="Arial Unicode MS"/>
+                <w:b/>
+                <w:color w:val="17324D"/>
+                <w:sz w:val="17"/>
+              </w:rPr>
+              <w:t>상태</w:t>
+            </w:r>
+          </w:p>
+        </w:tc>
+      </w:tr>
+      <w:tr>
+        <w:tc>
+          <w:tcPr>
+            <w:tcW w:type="dxa" w:w="3400"/>
+            <w:tcMar>
+              <w:top w:w="80" w:type="dxa"/>
+              <w:start w:w="110" w:type="dxa"/>
+              <w:bottom w:w="80" w:type="dxa"/>
+              <w:end w:w="110" w:type="dxa"/>
+            </w:tcMar>
+          </w:tcPr>
+          <w:p>
+            <w:pPr>
+              <w:spacing w:after="0"/>
+            </w:pPr>
+            <w:r>
+              <w:rPr>
+                <w:rFonts w:ascii="Arial Unicode MS" w:hAnsi="Arial Unicode MS" w:eastAsia="Arial Unicode MS" w:cs="Arial Unicode MS"/>
+                <w:b w:val="0"/>
+                <w:color w:val="1F2937"/>
+                <w:sz w:val="17"/>
+              </w:rPr>
+              <w:t>Kubernetes AI_BASE_URL</w:t>
+            </w:r>
+          </w:p>
+        </w:tc>
+        <w:tc>
+          <w:tcPr>
+            <w:tcW w:type="dxa" w:w="5960"/>
+            <w:tcMar>
+              <w:top w:w="80" w:type="dxa"/>
+              <w:start w:w="110" w:type="dxa"/>
+              <w:bottom w:w="80" w:type="dxa"/>
+              <w:end w:w="110" w:type="dxa"/>
+            </w:tcMar>
+          </w:tcPr>
+          <w:p>
+            <w:pPr>
+              <w:spacing w:after="0"/>
+            </w:pPr>
+            <w:r>
+              <w:rPr>
+                <w:rFonts w:ascii="Arial Unicode MS" w:hAnsi="Arial Unicode MS" w:eastAsia="Arial Unicode MS" w:cs="Arial Unicode MS"/>
+                <w:b w:val="0"/>
+                <w:color w:val="1F2937"/>
+                <w:sz w:val="17"/>
+              </w:rPr>
+              <w:t>로컬 manifest는 Internal HA DNS를 가리킴</w:t>
+            </w:r>
+          </w:p>
+        </w:tc>
+      </w:tr>
+      <w:tr>
+        <w:tc>
+          <w:tcPr>
+            <w:tcW w:type="dxa" w:w="3400"/>
+            <w:tcMar>
+              <w:top w:w="80" w:type="dxa"/>
+              <w:start w:w="110" w:type="dxa"/>
+              <w:bottom w:w="80" w:type="dxa"/>
+              <w:end w:w="110" w:type="dxa"/>
+            </w:tcMar>
+          </w:tcPr>
+          <w:p>
+            <w:pPr>
+              <w:spacing w:after="0"/>
+            </w:pPr>
+            <w:r>
+              <w:rPr>
+                <w:rFonts w:ascii="Arial Unicode MS" w:hAnsi="Arial Unicode MS" w:eastAsia="Arial Unicode MS" w:cs="Arial Unicode MS"/>
+                <w:b w:val="0"/>
+                <w:color w:val="1F2937"/>
+                <w:sz w:val="17"/>
+              </w:rPr>
+              <w:t>Live cluster 적용</w:t>
+            </w:r>
+          </w:p>
+        </w:tc>
+        <w:tc>
+          <w:tcPr>
+            <w:tcW w:type="dxa" w:w="5960"/>
+            <w:tcMar>
+              <w:top w:w="80" w:type="dxa"/>
+              <w:start w:w="110" w:type="dxa"/>
+              <w:bottom w:w="80" w:type="dxa"/>
+              <w:end w:w="110" w:type="dxa"/>
+            </w:tcMar>
+          </w:tcPr>
+          <w:p>
+            <w:pPr>
+              <w:spacing w:after="0"/>
+            </w:pPr>
+            <w:r>
+              <w:rPr>
+                <w:rFonts w:ascii="Arial Unicode MS" w:hAnsi="Arial Unicode MS" w:eastAsia="Arial Unicode MS" w:cs="Arial Unicode MS"/>
+                <w:b w:val="0"/>
+                <w:color w:val="1F2937"/>
+                <w:sz w:val="17"/>
+              </w:rPr>
+              <w:t>kic-iam-auth 부재로 해당 배포 세션에서는 미확인</w:t>
+            </w:r>
+          </w:p>
+        </w:tc>
+      </w:tr>
+      <w:tr>
+        <w:tc>
+          <w:tcPr>
+            <w:tcW w:type="dxa" w:w="3400"/>
+            <w:tcMar>
+              <w:top w:w="80" w:type="dxa"/>
+              <w:start w:w="110" w:type="dxa"/>
+              <w:bottom w:w="80" w:type="dxa"/>
+              <w:end w:w="110" w:type="dxa"/>
+            </w:tcMar>
+          </w:tcPr>
+          <w:p>
+            <w:pPr>
+              <w:spacing w:after="0"/>
+            </w:pPr>
+            <w:r>
+              <w:rPr>
+                <w:rFonts w:ascii="Arial Unicode MS" w:hAnsi="Arial Unicode MS" w:eastAsia="Arial Unicode MS" w:cs="Arial Unicode MS"/>
+                <w:b w:val="0"/>
+                <w:color w:val="1F2937"/>
+                <w:sz w:val="17"/>
+              </w:rPr>
+              <w:t>장기 트래픽 A/B</w:t>
+            </w:r>
+          </w:p>
+        </w:tc>
+        <w:tc>
+          <w:tcPr>
+            <w:tcW w:type="dxa" w:w="5960"/>
+            <w:tcMar>
+              <w:top w:w="80" w:type="dxa"/>
+              <w:start w:w="110" w:type="dxa"/>
+              <w:bottom w:w="80" w:type="dxa"/>
+              <w:end w:w="110" w:type="dxa"/>
+            </w:tcMar>
+          </w:tcPr>
+          <w:p>
+            <w:pPr>
+              <w:spacing w:after="0"/>
+            </w:pPr>
+            <w:r>
+              <w:rPr>
+                <w:rFonts w:ascii="Arial Unicode MS" w:hAnsi="Arial Unicode MS" w:eastAsia="Arial Unicode MS" w:cs="Arial Unicode MS"/>
+                <w:b w:val="0"/>
+                <w:color w:val="1F2937"/>
+                <w:sz w:val="17"/>
+              </w:rPr>
+              <w:t>미수행; 운영 로그 축적 후 재평가</w:t>
+            </w:r>
+          </w:p>
+        </w:tc>
+      </w:tr>
+      <w:tr>
+        <w:tc>
+          <w:tcPr>
+            <w:tcW w:type="dxa" w:w="3400"/>
+            <w:tcMar>
+              <w:top w:w="80" w:type="dxa"/>
+              <w:start w:w="110" w:type="dxa"/>
+              <w:bottom w:w="80" w:type="dxa"/>
+              <w:end w:w="110" w:type="dxa"/>
+            </w:tcMar>
+          </w:tcPr>
+          <w:p>
+            <w:pPr>
+              <w:spacing w:after="0"/>
+            </w:pPr>
+            <w:r>
+              <w:rPr>
+                <w:rFonts w:ascii="Arial Unicode MS" w:hAnsi="Arial Unicode MS" w:eastAsia="Arial Unicode MS" w:cs="Arial Unicode MS"/>
+                <w:b w:val="0"/>
+                <w:color w:val="1F2937"/>
+                <w:sz w:val="17"/>
+              </w:rPr>
+              <w:t>GPU failover</w:t>
+            </w:r>
+          </w:p>
+        </w:tc>
+        <w:tc>
+          <w:tcPr>
+            <w:tcW w:type="dxa" w:w="5960"/>
+            <w:tcMar>
+              <w:top w:w="80" w:type="dxa"/>
+              <w:start w:w="110" w:type="dxa"/>
+              <w:bottom w:w="80" w:type="dxa"/>
+              <w:end w:w="110" w:type="dxa"/>
+            </w:tcMar>
+          </w:tcPr>
+          <w:p>
+            <w:pPr>
+              <w:spacing w:after="0"/>
+            </w:pPr>
+            <w:r>
+              <w:rPr>
+                <w:rFonts w:ascii="Arial Unicode MS" w:hAnsi="Arial Unicode MS" w:eastAsia="Arial Unicode MS" w:cs="Arial Unicode MS"/>
+                <w:b w:val="0"/>
+                <w:color w:val="1F2937"/>
+                <w:sz w:val="17"/>
+              </w:rPr>
+              <w:t>LB 구성 완료; 강제 장애 전환 시나리오 후속 검증</w:t>
+            </w:r>
+          </w:p>
+        </w:tc>
+      </w:tr>
+    </w:tbl>
+    <w:tbl>
+      <w:tblPr>
+        <w:tblW w:type="dxa" w:w="9360"/>
+        <w:jc w:val="center"/>
+        <w:tblLayout w:type="fixed"/>
+        <w:tblLook w:firstColumn="1" w:firstRow="1" w:lastColumn="0" w:lastRow="0" w:noHBand="0" w:noVBand="1" w:val="04A0"/>
+      </w:tblPr>
+      <w:tblGrid>
+        <w:gridCol w:w="180"/>
+        <w:gridCol w:w="9180"/>
+      </w:tblGrid>
+      <w:tr>
+        <w:tc>
+          <w:tcPr>
+            <w:tcW w:type="dxa" w:w="180"/>
+            <w:vAlign w:val="center"/>
+            <w:shd w:fill="2E74B5"/>
+            <w:tcMar>
+              <w:top w:w="105" w:type="dxa"/>
+              <w:start w:w="125" w:type="dxa"/>
+              <w:bottom w:w="105" w:type="dxa"/>
+              <w:end w:w="125" w:type="dxa"/>
+            </w:tcMar>
+          </w:tcPr>
+          <w:p/>
+        </w:tc>
+        <w:tc>
+          <w:tcPr>
+            <w:tcW w:type="dxa" w:w="9180"/>
+            <w:vAlign w:val="center"/>
+            <w:shd w:fill="EAF2F8"/>
+            <w:tcMar>
+              <w:top w:w="105" w:type="dxa"/>
+              <w:start w:w="125" w:type="dxa"/>
+              <w:bottom w:w="105" w:type="dxa"/>
+              <w:end w:w="125" w:type="dxa"/>
+            </w:tcMar>
+          </w:tcPr>
+          <w:p>
+            <w:pPr>
+              <w:spacing w:after="0"/>
+            </w:pPr>
+            <w:r>
+              <w:rPr>
+                <w:rFonts w:ascii="Arial Unicode MS" w:hAnsi="Arial Unicode MS" w:eastAsia="Arial Unicode MS" w:cs="Arial Unicode MS"/>
+                <w:b/>
+                <w:color w:val="17324D"/>
+                <w:sz w:val="19"/>
+              </w:rPr>
+              <w:t>발표 시에는 ‘모든 문제가 해결됐다’가 아니라, 검증된 품질 개선·이중 GPU 배포·남은 운영 확인 항목을 분리해 설명합니다.</w:t>
+            </w:r>
+          </w:p>
+        </w:tc>
+      </w:tr>
+    </w:tbl>
+    <w:p>
+      <w:pPr>
+        <w:spacing w:after="20"/>
+      </w:pPr>
+    </w:p>
     <w:sectPr>
-      <w:pgSz w:w="11909" w:h="16834"/>
-      <w:pgMar w:top="259" w:right="259" w:bottom="259" w:left="259" w:header="720" w:footer="720" w:gutter="0"/>
+      <w:headerReference w:type="default" r:id="rId9"/>
+      <w:footerReference w:type="default" r:id="rId10"/>
+      <w:pgSz w:w="12240" w:h="15840"/>
+      <w:pgMar w:top="1080" w:right="1181" w:bottom="1008" w:left="1181" w:header="504" w:footer="504" w:gutter="0"/>
       <w:cols w:space="720"/>
       <w:docGrid w:linePitch="360"/>
     </w:sectPr>
   </w:body>
 </w:document>
+</file>
+
+<file path=word/footer1.xml><?xml version="1.0" encoding="utf-8"?>
+<w:ftr xmlns:m="http://schemas.openxmlformats.org/officeDocument/2006/math" xmlns:mc="http://schemas.openxmlformats.org/markup-compatibility/2006" xmlns:mo="http://schemas.microsoft.com/office/mac/office/2008/main" xmlns:mv="urn:schemas-microsoft-com:mac:vml" xmlns:o="urn:schemas-microsoft-com:office:office" xmlns:r="http://schemas.openxmlformats.org/officeDocument/2006/relationships" xmlns:v="urn:schemas-microsoft-com:vml" xmlns:w10="urn:schemas-microsoft-com:office:word" xmlns:w14="http://schemas.microsoft.com/office/word/2010/wordml" xmlns:w="http://schemas.openxmlformats.org/wordprocessingml/2006/main" xmlns:wne="http://schemas.microsoft.com/office/word/2006/wordml" xmlns:wp14="http://schemas.microsoft.com/office/word/2010/wordprocessingDrawing" xmlns:wp="http://schemas.openxmlformats.org/drawingml/2006/wordprocessingDrawing" xmlns:wpc="http://schemas.microsoft.com/office/word/2010/wordprocessingCanvas" xmlns:wpg="http://schemas.microsoft.com/office/word/2010/wordprocessingGroup" xmlns:wpi="http://schemas.microsoft.com/office/word/2010/wordprocessingInk" xmlns:wps="http://schemas.microsoft.com/office/word/2010/wordprocessingShape" mc:Ignorable="w14 wp14">
+  <w:p>
+    <w:pPr>
+      <w:pStyle w:val="Footer"/>
+      <w:jc w:val="center"/>
+    </w:pPr>
+    <w:r>
+      <w:rPr>
+        <w:rFonts w:ascii="Arial Unicode MS" w:hAnsi="Arial Unicode MS" w:eastAsia="Arial Unicode MS" w:cs="Arial Unicode MS"/>
+        <w:b w:val="0"/>
+        <w:color w:val="5B6573"/>
+        <w:sz w:val="16"/>
+      </w:rPr>
+      <w:t xml:space="preserve">최종 검증 기준 2026-08-19  ·  </w:t>
+    </w:r>
+    <w:r>
+      <w:rPr>
+        <w:rFonts w:ascii="Arial Unicode MS" w:hAnsi="Arial Unicode MS" w:eastAsia="Arial Unicode MS" w:cs="Arial Unicode MS"/>
+        <w:b w:val="0"/>
+        <w:color w:val="5B6573"/>
+        <w:sz w:val="16"/>
+      </w:rPr>
+      <w:fldChar w:fldCharType="begin"/>
+      <w:instrText xml:space="preserve">PAGE</w:instrText>
+      <w:fldChar w:fldCharType="separate"/>
+      <w:fldChar w:fldCharType="end"/>
+    </w:r>
+  </w:p>
+</w:ftr>
+</file>
+
+<file path=word/header1.xml><?xml version="1.0" encoding="utf-8"?>
+<w:hdr xmlns:m="http://schemas.openxmlformats.org/officeDocument/2006/math" xmlns:mc="http://schemas.openxmlformats.org/markup-compatibility/2006" xmlns:mo="http://schemas.microsoft.com/office/mac/office/2008/main" xmlns:mv="urn:schemas-microsoft-com:mac:vml" xmlns:o="urn:schemas-microsoft-com:office:office" xmlns:r="http://schemas.openxmlformats.org/officeDocument/2006/relationships" xmlns:v="urn:schemas-microsoft-com:vml" xmlns:w10="urn:schemas-microsoft-com:office:word" xmlns:w14="http://schemas.microsoft.com/office/word/2010/wordml" xmlns:w="http://schemas.openxmlformats.org/wordprocessingml/2006/main" xmlns:wne="http://schemas.microsoft.com/office/word/2006/wordml" xmlns:wp14="http://schemas.microsoft.com/office/word/2010/wordprocessingDrawing" xmlns:wp="http://schemas.openxmlformats.org/drawingml/2006/wordprocessingDrawing" xmlns:wpc="http://schemas.microsoft.com/office/word/2010/wordprocessingCanvas" xmlns:wpg="http://schemas.microsoft.com/office/word/2010/wordprocessingGroup" xmlns:wpi="http://schemas.microsoft.com/office/word/2010/wordprocessingInk" xmlns:wps="http://schemas.microsoft.com/office/word/2010/wordprocessingShape" mc:Ignorable="w14 wp14">
+  <w:p>
+    <w:pPr>
+      <w:pStyle w:val="Header"/>
+      <w:jc w:val="right"/>
+    </w:pPr>
+    <w:r>
+      <w:rPr>
+        <w:rFonts w:ascii="Arial Unicode MS" w:hAnsi="Arial Unicode MS" w:eastAsia="Arial Unicode MS" w:cs="Arial Unicode MS"/>
+        <w:b/>
+        <w:color w:val="5B6573"/>
+        <w:sz w:val="16"/>
+      </w:rPr>
+      <w:t>MUSUBI  |  AI 변경사항</w:t>
+    </w:r>
+  </w:p>
+</w:hdr>
 </file>
 
 <file path=word/numbering.xml><?xml version="1.0" encoding="utf-8"?>
@@ -505,6 +2771,14 @@
     <w:name w:val="Normal"/>
     <w:qFormat/>
     <w:rsid w:val="00FC693F"/>
+    <w:pPr>
+      <w:spacing w:after="100" w:line="259" w:lineRule="auto"/>
+    </w:pPr>
+    <w:rPr>
+      <w:rFonts w:ascii="Arial Unicode MS" w:hAnsi="Arial Unicode MS" w:eastAsia="Arial Unicode MS" w:cs="Arial Unicode MS"/>
+      <w:color w:val="1F2937"/>
+      <w:sz w:val="19"/>
+    </w:rPr>
   </w:style>
   <w:style w:type="paragraph" w:styleId="Header">
     <w:name w:val="header"/>
@@ -561,15 +2835,15 @@
     <w:pPr>
       <w:keepNext/>
       <w:keepLines/>
-      <w:spacing w:before="480" w:after="0"/>
+      <w:spacing w:before="260" w:after="140"/>
       <w:outlineLvl w:val="0"/>
     </w:pPr>
     <w:rPr>
-      <w:rFonts w:asciiTheme="majorHAnsi" w:eastAsiaTheme="majorEastAsia" w:hAnsiTheme="majorHAnsi" w:cstheme="majorBidi"/>
+      <w:rFonts w:asciiTheme="majorHAnsi" w:eastAsiaTheme="majorEastAsia" w:hAnsiTheme="majorHAnsi" w:cstheme="majorBidi" w:ascii="Arial Unicode MS" w:hAnsi="Arial Unicode MS" w:eastAsia="Arial Unicode MS" w:cs="Arial Unicode MS"/>
       <w:b/>
       <w:bCs/>
-      <w:color w:val="365F91" w:themeColor="accent1" w:themeShade="BF"/>
-      <w:sz w:val="28"/>
+      <w:color w:val="17324D"/>
+      <w:sz w:val="34"/>
       <w:szCs w:val="28"/>
     </w:rPr>
   </w:style>
@@ -585,15 +2859,15 @@
     <w:pPr>
       <w:keepNext/>
       <w:keepLines/>
-      <w:spacing w:before="200" w:after="0"/>
+      <w:spacing w:before="180" w:after="100"/>
       <w:outlineLvl w:val="1"/>
     </w:pPr>
     <w:rPr>
-      <w:rFonts w:asciiTheme="majorHAnsi" w:eastAsiaTheme="majorEastAsia" w:hAnsiTheme="majorHAnsi" w:cstheme="majorBidi"/>
+      <w:rFonts w:asciiTheme="majorHAnsi" w:eastAsiaTheme="majorEastAsia" w:hAnsiTheme="majorHAnsi" w:cstheme="majorBidi" w:ascii="Arial Unicode MS" w:hAnsi="Arial Unicode MS" w:eastAsia="Arial Unicode MS" w:cs="Arial Unicode MS"/>
       <w:b/>
       <w:bCs/>
-      <w:color w:val="4F81BD" w:themeColor="accent1"/>
-      <w:sz w:val="26"/>
+      <w:color w:val="2E74B5"/>
+      <w:sz w:val="25"/>
       <w:szCs w:val="26"/>
     </w:rPr>
   </w:style>
@@ -609,14 +2883,15 @@
     <w:pPr>
       <w:keepNext/>
       <w:keepLines/>
-      <w:spacing w:before="200" w:after="0"/>
+      <w:spacing w:before="120" w:after="60"/>
       <w:outlineLvl w:val="2"/>
     </w:pPr>
     <w:rPr>
-      <w:rFonts w:asciiTheme="majorHAnsi" w:eastAsiaTheme="majorEastAsia" w:hAnsiTheme="majorHAnsi" w:cstheme="majorBidi"/>
+      <w:rFonts w:asciiTheme="majorHAnsi" w:eastAsiaTheme="majorEastAsia" w:hAnsiTheme="majorHAnsi" w:cstheme="majorBidi" w:ascii="Arial Unicode MS" w:hAnsi="Arial Unicode MS" w:eastAsia="Arial Unicode MS" w:cs="Arial Unicode MS"/>
       <w:b/>
       <w:bCs/>
-      <w:color w:val="4F81BD" w:themeColor="accent1"/>
+      <w:color w:val="17324D"/>
+      <w:sz w:val="21"/>
     </w:rPr>
   </w:style>
   <w:style w:type="paragraph" w:styleId="Heading4">
@@ -636,7 +2911,7 @@
       <w:outlineLvl w:val="3"/>
     </w:pPr>
     <w:rPr>
-      <w:rFonts w:asciiTheme="majorHAnsi" w:eastAsiaTheme="majorEastAsia" w:hAnsiTheme="majorHAnsi" w:cstheme="majorBidi"/>
+      <w:rFonts w:asciiTheme="majorHAnsi" w:eastAsiaTheme="majorEastAsia" w:hAnsiTheme="majorHAnsi" w:cstheme="majorBidi" w:ascii="Arial Unicode MS" w:hAnsi="Arial Unicode MS" w:eastAsia="Arial Unicode MS" w:cs="Arial Unicode MS"/>
       <w:b/>
       <w:bCs/>
       <w:i/>
@@ -661,7 +2936,7 @@
       <w:outlineLvl w:val="4"/>
     </w:pPr>
     <w:rPr>
-      <w:rFonts w:asciiTheme="majorHAnsi" w:eastAsiaTheme="majorEastAsia" w:hAnsiTheme="majorHAnsi" w:cstheme="majorBidi"/>
+      <w:rFonts w:asciiTheme="majorHAnsi" w:eastAsiaTheme="majorEastAsia" w:hAnsiTheme="majorHAnsi" w:cstheme="majorBidi" w:ascii="Arial Unicode MS" w:hAnsi="Arial Unicode MS" w:eastAsia="Arial Unicode MS" w:cs="Arial Unicode MS"/>
       <w:color w:val="243F60" w:themeColor="accent1" w:themeShade="7F"/>
     </w:rPr>
   </w:style>
@@ -682,7 +2957,7 @@
       <w:outlineLvl w:val="5"/>
     </w:pPr>
     <w:rPr>
-      <w:rFonts w:asciiTheme="majorHAnsi" w:eastAsiaTheme="majorEastAsia" w:hAnsiTheme="majorHAnsi" w:cstheme="majorBidi"/>
+      <w:rFonts w:asciiTheme="majorHAnsi" w:eastAsiaTheme="majorEastAsia" w:hAnsiTheme="majorHAnsi" w:cstheme="majorBidi" w:ascii="Arial Unicode MS" w:hAnsi="Arial Unicode MS" w:eastAsia="Arial Unicode MS" w:cs="Arial Unicode MS"/>
       <w:i/>
       <w:iCs/>
       <w:color w:val="243F60" w:themeColor="accent1" w:themeShade="7F"/>
@@ -705,7 +2980,7 @@
       <w:outlineLvl w:val="6"/>
     </w:pPr>
     <w:rPr>
-      <w:rFonts w:asciiTheme="majorHAnsi" w:eastAsiaTheme="majorEastAsia" w:hAnsiTheme="majorHAnsi" w:cstheme="majorBidi"/>
+      <w:rFonts w:asciiTheme="majorHAnsi" w:eastAsiaTheme="majorEastAsia" w:hAnsiTheme="majorHAnsi" w:cstheme="majorBidi" w:ascii="Arial Unicode MS" w:hAnsi="Arial Unicode MS" w:eastAsia="Arial Unicode MS" w:cs="Arial Unicode MS"/>
       <w:i/>
       <w:iCs/>
       <w:color w:val="404040" w:themeColor="text1" w:themeTint="BF"/>
@@ -728,7 +3003,7 @@
       <w:outlineLvl w:val="7"/>
     </w:pPr>
     <w:rPr>
-      <w:rFonts w:asciiTheme="majorHAnsi" w:eastAsiaTheme="majorEastAsia" w:hAnsiTheme="majorHAnsi" w:cstheme="majorBidi"/>
+      <w:rFonts w:asciiTheme="majorHAnsi" w:eastAsiaTheme="majorEastAsia" w:hAnsiTheme="majorHAnsi" w:cstheme="majorBidi" w:ascii="Arial Unicode MS" w:hAnsi="Arial Unicode MS" w:eastAsia="Arial Unicode MS" w:cs="Arial Unicode MS"/>
       <w:color w:val="4F81BD" w:themeColor="accent1"/>
       <w:sz w:val="20"/>
       <w:szCs w:val="20"/>
@@ -751,7 +3026,7 @@
       <w:outlineLvl w:val="8"/>
     </w:pPr>
     <w:rPr>
-      <w:rFonts w:asciiTheme="majorHAnsi" w:eastAsiaTheme="majorEastAsia" w:hAnsiTheme="majorHAnsi" w:cstheme="majorBidi"/>
+      <w:rFonts w:asciiTheme="majorHAnsi" w:eastAsiaTheme="majorEastAsia" w:hAnsiTheme="majorHAnsi" w:cstheme="majorBidi" w:ascii="Arial Unicode MS" w:hAnsi="Arial Unicode MS" w:eastAsia="Arial Unicode MS" w:cs="Arial Unicode MS"/>
       <w:i/>
       <w:iCs/>
       <w:color w:val="404040" w:themeColor="text1" w:themeTint="BF"/>
@@ -802,7 +3077,7 @@
     <w:uiPriority w:val="9"/>
     <w:rsid w:val="00FC693F"/>
     <w:rPr>
-      <w:rFonts w:asciiTheme="majorHAnsi" w:eastAsiaTheme="majorEastAsia" w:hAnsiTheme="majorHAnsi" w:cstheme="majorBidi"/>
+      <w:rFonts w:asciiTheme="majorHAnsi" w:eastAsiaTheme="majorEastAsia" w:hAnsiTheme="majorHAnsi" w:cstheme="majorBidi" w:ascii="Arial Unicode MS" w:hAnsi="Arial Unicode MS" w:eastAsia="Arial Unicode MS" w:cs="Arial Unicode MS"/>
       <w:b/>
       <w:bCs/>
       <w:color w:val="365F91" w:themeColor="accent1" w:themeShade="BF"/>
@@ -817,7 +3092,7 @@
     <w:uiPriority w:val="9"/>
     <w:rsid w:val="00FC693F"/>
     <w:rPr>
-      <w:rFonts w:asciiTheme="majorHAnsi" w:eastAsiaTheme="majorEastAsia" w:hAnsiTheme="majorHAnsi" w:cstheme="majorBidi"/>
+      <w:rFonts w:asciiTheme="majorHAnsi" w:eastAsiaTheme="majorEastAsia" w:hAnsiTheme="majorHAnsi" w:cstheme="majorBidi" w:ascii="Arial Unicode MS" w:hAnsi="Arial Unicode MS" w:eastAsia="Arial Unicode MS" w:cs="Arial Unicode MS"/>
       <w:b/>
       <w:bCs/>
       <w:color w:val="4F81BD" w:themeColor="accent1"/>
@@ -832,7 +3107,7 @@
     <w:uiPriority w:val="9"/>
     <w:rsid w:val="00FC693F"/>
     <w:rPr>
-      <w:rFonts w:asciiTheme="majorHAnsi" w:eastAsiaTheme="majorEastAsia" w:hAnsiTheme="majorHAnsi" w:cstheme="majorBidi"/>
+      <w:rFonts w:asciiTheme="majorHAnsi" w:eastAsiaTheme="majorEastAsia" w:hAnsiTheme="majorHAnsi" w:cstheme="majorBidi" w:ascii="Arial Unicode MS" w:hAnsi="Arial Unicode MS" w:eastAsia="Arial Unicode MS" w:cs="Arial Unicode MS"/>
       <w:b/>
       <w:bCs/>
       <w:color w:val="4F81BD" w:themeColor="accent1"/>
@@ -847,18 +3122,20 @@
     <w:qFormat/>
     <w:rsid w:val="00FC693F"/>
     <w:pPr>
+      <w:keepNext/>
       <w:pBdr>
         <w:bottom w:val="single" w:sz="8" w:space="4" w:color="4F81BD" w:themeColor="accent1"/>
       </w:pBdr>
-      <w:spacing w:after="300" w:line="240" w:lineRule="auto"/>
+      <w:spacing w:after="200" w:line="240" w:lineRule="auto" w:before="0"/>
       <w:contextualSpacing/>
     </w:pPr>
     <w:rPr>
-      <w:rFonts w:asciiTheme="majorHAnsi" w:eastAsiaTheme="majorEastAsia" w:hAnsiTheme="majorHAnsi" w:cstheme="majorBidi"/>
-      <w:color w:val="17365D" w:themeColor="text2" w:themeShade="BF"/>
+      <w:rFonts w:asciiTheme="majorHAnsi" w:eastAsiaTheme="majorEastAsia" w:hAnsiTheme="majorHAnsi" w:cstheme="majorBidi" w:ascii="Arial Unicode MS" w:hAnsi="Arial Unicode MS" w:eastAsia="Arial Unicode MS" w:cs="Arial Unicode MS"/>
+      <w:b/>
+      <w:color w:val="17324D"/>
       <w:spacing w:val="5"/>
       <w:kern w:val="28"/>
-      <w:sz w:val="52"/>
+      <w:sz w:val="56"/>
       <w:szCs w:val="52"/>
     </w:rPr>
   </w:style>
@@ -869,7 +3146,7 @@
     <w:uiPriority w:val="10"/>
     <w:rsid w:val="00FC693F"/>
     <w:rPr>
-      <w:rFonts w:asciiTheme="majorHAnsi" w:eastAsiaTheme="majorEastAsia" w:hAnsiTheme="majorHAnsi" w:cstheme="majorBidi"/>
+      <w:rFonts w:asciiTheme="majorHAnsi" w:eastAsiaTheme="majorEastAsia" w:hAnsiTheme="majorHAnsi" w:cstheme="majorBidi" w:ascii="Arial Unicode MS" w:hAnsi="Arial Unicode MS" w:eastAsia="Arial Unicode MS" w:cs="Arial Unicode MS"/>
       <w:color w:val="17365D" w:themeColor="text2" w:themeShade="BF"/>
       <w:spacing w:val="5"/>
       <w:kern w:val="28"/>
@@ -891,7 +3168,7 @@
       </w:numPr>
     </w:pPr>
     <w:rPr>
-      <w:rFonts w:asciiTheme="majorHAnsi" w:eastAsiaTheme="majorEastAsia" w:hAnsiTheme="majorHAnsi" w:cstheme="majorBidi"/>
+      <w:rFonts w:asciiTheme="majorHAnsi" w:eastAsiaTheme="majorEastAsia" w:hAnsiTheme="majorHAnsi" w:cstheme="majorBidi" w:ascii="Arial Unicode MS" w:hAnsi="Arial Unicode MS" w:eastAsia="Arial Unicode MS" w:cs="Arial Unicode MS"/>
       <w:i/>
       <w:iCs/>
       <w:color w:val="4F81BD" w:themeColor="accent1"/>
@@ -907,7 +3184,7 @@
     <w:uiPriority w:val="11"/>
     <w:rsid w:val="00FC693F"/>
     <w:rPr>
-      <w:rFonts w:asciiTheme="majorHAnsi" w:eastAsiaTheme="majorEastAsia" w:hAnsiTheme="majorHAnsi" w:cstheme="majorBidi"/>
+      <w:rFonts w:asciiTheme="majorHAnsi" w:eastAsiaTheme="majorEastAsia" w:hAnsiTheme="majorHAnsi" w:cstheme="majorBidi" w:ascii="Arial Unicode MS" w:hAnsi="Arial Unicode MS" w:eastAsia="Arial Unicode MS" w:cs="Arial Unicode MS"/>
       <w:i/>
       <w:iCs/>
       <w:color w:val="4F81BD" w:themeColor="accent1"/>
@@ -974,6 +3251,7 @@
       <w:spacing w:after="120"/>
     </w:pPr>
     <w:rPr>
+      <w:rFonts w:ascii="Arial Unicode MS" w:hAnsi="Arial Unicode MS" w:eastAsia="Arial Unicode MS" w:cs="Arial Unicode MS"/>
       <w:sz w:val="16"/>
       <w:szCs w:val="16"/>
     </w:rPr>
@@ -985,6 +3263,7 @@
     <w:uiPriority w:val="99"/>
     <w:rsid w:val="00AA1D8D"/>
     <w:rPr>
+      <w:rFonts w:ascii="Arial Unicode MS" w:hAnsi="Arial Unicode MS" w:eastAsia="Arial Unicode MS" w:cs="Arial Unicode MS"/>
       <w:sz w:val="16"/>
       <w:szCs w:val="16"/>
     </w:rPr>
@@ -1032,8 +3311,14 @@
       <w:numPr>
         <w:numId w:val="1"/>
       </w:numPr>
+      <w:spacing w:after="60"/>
+      <w:ind w:left="374" w:hanging="230"/>
       <w:contextualSpacing/>
     </w:pPr>
+    <w:rPr>
+      <w:rFonts w:ascii="Arial Unicode MS" w:hAnsi="Arial Unicode MS" w:eastAsia="Arial Unicode MS" w:cs="Arial Unicode MS"/>
+      <w:sz w:val="19"/>
+    </w:rPr>
   </w:style>
   <w:style w:type="paragraph" w:styleId="ListBullet2">
     <w:name w:val="List Bullet 2"/>
@@ -1071,8 +3356,14 @@
       <w:numPr>
         <w:numId w:val="5"/>
       </w:numPr>
+      <w:spacing w:after="60"/>
+      <w:ind w:left="374" w:hanging="230"/>
       <w:contextualSpacing/>
     </w:pPr>
+    <w:rPr>
+      <w:rFonts w:ascii="Arial Unicode MS" w:hAnsi="Arial Unicode MS" w:eastAsia="Arial Unicode MS" w:cs="Arial Unicode MS"/>
+      <w:sz w:val="19"/>
+    </w:rPr>
   </w:style>
   <w:style w:type="paragraph" w:styleId="ListNumber2">
     <w:name w:val="List Number 2"/>
@@ -1154,7 +3445,7 @@
       </w:tabs>
     </w:pPr>
     <w:rPr>
-      <w:rFonts w:ascii="Courier" w:hAnsi="Courier"/>
+      <w:rFonts w:ascii="Arial Unicode MS" w:hAnsi="Arial Unicode MS" w:eastAsia="Arial Unicode MS" w:cs="Arial Unicode MS"/>
       <w:sz w:val="20"/>
       <w:szCs w:val="20"/>
     </w:rPr>
@@ -1166,7 +3457,7 @@
     <w:uiPriority w:val="99"/>
     <w:rsid w:val="0029639D"/>
     <w:rPr>
-      <w:rFonts w:ascii="Courier" w:hAnsi="Courier"/>
+      <w:rFonts w:ascii="Arial Unicode MS" w:hAnsi="Arial Unicode MS" w:eastAsia="Arial Unicode MS" w:cs="Arial Unicode MS"/>
       <w:sz w:val="20"/>
       <w:szCs w:val="20"/>
     </w:rPr>
@@ -1180,6 +3471,7 @@
     <w:qFormat/>
     <w:rsid w:val="00FC693F"/>
     <w:rPr>
+      <w:rFonts w:ascii="Arial Unicode MS" w:hAnsi="Arial Unicode MS" w:eastAsia="Arial Unicode MS" w:cs="Arial Unicode MS"/>
       <w:i/>
       <w:iCs/>
       <w:color w:val="000000" w:themeColor="text1"/>
@@ -1192,6 +3484,7 @@
     <w:uiPriority w:val="29"/>
     <w:rsid w:val="00FC693F"/>
     <w:rPr>
+      <w:rFonts w:ascii="Arial Unicode MS" w:hAnsi="Arial Unicode MS" w:eastAsia="Arial Unicode MS" w:cs="Arial Unicode MS"/>
       <w:i/>
       <w:iCs/>
       <w:color w:val="000000" w:themeColor="text1"/>
@@ -1205,7 +3498,7 @@
     <w:semiHidden/>
     <w:rsid w:val="00FC693F"/>
     <w:rPr>
-      <w:rFonts w:asciiTheme="majorHAnsi" w:eastAsiaTheme="majorEastAsia" w:hAnsiTheme="majorHAnsi" w:cstheme="majorBidi"/>
+      <w:rFonts w:asciiTheme="majorHAnsi" w:eastAsiaTheme="majorEastAsia" w:hAnsiTheme="majorHAnsi" w:cstheme="majorBidi" w:ascii="Arial Unicode MS" w:hAnsi="Arial Unicode MS" w:eastAsia="Arial Unicode MS" w:cs="Arial Unicode MS"/>
       <w:b/>
       <w:bCs/>
       <w:i/>
@@ -1221,7 +3514,7 @@
     <w:semiHidden/>
     <w:rsid w:val="00FC693F"/>
     <w:rPr>
-      <w:rFonts w:asciiTheme="majorHAnsi" w:eastAsiaTheme="majorEastAsia" w:hAnsiTheme="majorHAnsi" w:cstheme="majorBidi"/>
+      <w:rFonts w:asciiTheme="majorHAnsi" w:eastAsiaTheme="majorEastAsia" w:hAnsiTheme="majorHAnsi" w:cstheme="majorBidi" w:ascii="Arial Unicode MS" w:hAnsi="Arial Unicode MS" w:eastAsia="Arial Unicode MS" w:cs="Arial Unicode MS"/>
       <w:color w:val="243F60" w:themeColor="accent1" w:themeShade="7F"/>
     </w:rPr>
   </w:style>
@@ -1233,7 +3526,7 @@
     <w:semiHidden/>
     <w:rsid w:val="00FC693F"/>
     <w:rPr>
-      <w:rFonts w:asciiTheme="majorHAnsi" w:eastAsiaTheme="majorEastAsia" w:hAnsiTheme="majorHAnsi" w:cstheme="majorBidi"/>
+      <w:rFonts w:asciiTheme="majorHAnsi" w:eastAsiaTheme="majorEastAsia" w:hAnsiTheme="majorHAnsi" w:cstheme="majorBidi" w:ascii="Arial Unicode MS" w:hAnsi="Arial Unicode MS" w:eastAsia="Arial Unicode MS" w:cs="Arial Unicode MS"/>
       <w:i/>
       <w:iCs/>
       <w:color w:val="243F60" w:themeColor="accent1" w:themeShade="7F"/>
@@ -1247,7 +3540,7 @@
     <w:semiHidden/>
     <w:rsid w:val="00FC693F"/>
     <w:rPr>
-      <w:rFonts w:asciiTheme="majorHAnsi" w:eastAsiaTheme="majorEastAsia" w:hAnsiTheme="majorHAnsi" w:cstheme="majorBidi"/>
+      <w:rFonts w:asciiTheme="majorHAnsi" w:eastAsiaTheme="majorEastAsia" w:hAnsiTheme="majorHAnsi" w:cstheme="majorBidi" w:ascii="Arial Unicode MS" w:hAnsi="Arial Unicode MS" w:eastAsia="Arial Unicode MS" w:cs="Arial Unicode MS"/>
       <w:i/>
       <w:iCs/>
       <w:color w:val="404040" w:themeColor="text1" w:themeTint="BF"/>
@@ -1261,7 +3554,7 @@
     <w:semiHidden/>
     <w:rsid w:val="00FC693F"/>
     <w:rPr>
-      <w:rFonts w:asciiTheme="majorHAnsi" w:eastAsiaTheme="majorEastAsia" w:hAnsiTheme="majorHAnsi" w:cstheme="majorBidi"/>
+      <w:rFonts w:asciiTheme="majorHAnsi" w:eastAsiaTheme="majorEastAsia" w:hAnsiTheme="majorHAnsi" w:cstheme="majorBidi" w:ascii="Arial Unicode MS" w:hAnsi="Arial Unicode MS" w:eastAsia="Arial Unicode MS" w:cs="Arial Unicode MS"/>
       <w:color w:val="4F81BD" w:themeColor="accent1"/>
       <w:sz w:val="20"/>
       <w:szCs w:val="20"/>
@@ -1275,7 +3568,7 @@
     <w:semiHidden/>
     <w:rsid w:val="00FC693F"/>
     <w:rPr>
-      <w:rFonts w:asciiTheme="majorHAnsi" w:eastAsiaTheme="majorEastAsia" w:hAnsiTheme="majorHAnsi" w:cstheme="majorBidi"/>
+      <w:rFonts w:asciiTheme="majorHAnsi" w:eastAsiaTheme="majorEastAsia" w:hAnsiTheme="majorHAnsi" w:cstheme="majorBidi" w:ascii="Arial Unicode MS" w:hAnsi="Arial Unicode MS" w:eastAsia="Arial Unicode MS" w:cs="Arial Unicode MS"/>
       <w:i/>
       <w:iCs/>
       <w:color w:val="404040" w:themeColor="text1" w:themeTint="BF"/>
@@ -1296,6 +3589,7 @@
       <w:spacing w:line="240" w:lineRule="auto"/>
     </w:pPr>
     <w:rPr>
+      <w:rFonts w:ascii="Arial Unicode MS" w:hAnsi="Arial Unicode MS" w:eastAsia="Arial Unicode MS" w:cs="Arial Unicode MS"/>
       <w:b/>
       <w:bCs/>
       <w:color w:val="4F81BD" w:themeColor="accent1"/>
@@ -1310,6 +3604,7 @@
     <w:qFormat/>
     <w:rsid w:val="00FC693F"/>
     <w:rPr>
+      <w:rFonts w:ascii="Arial Unicode MS" w:hAnsi="Arial Unicode MS" w:eastAsia="Arial Unicode MS" w:cs="Arial Unicode MS"/>
       <w:b/>
       <w:bCs/>
     </w:rPr>
@@ -1321,6 +3616,7 @@
     <w:qFormat/>
     <w:rsid w:val="00FC693F"/>
     <w:rPr>
+      <w:rFonts w:ascii="Arial Unicode MS" w:hAnsi="Arial Unicode MS" w:eastAsia="Arial Unicode MS" w:cs="Arial Unicode MS"/>
       <w:i/>
       <w:iCs/>
     </w:rPr>
@@ -1341,6 +3637,7 @@
       <w:ind w:left="936" w:right="936"/>
     </w:pPr>
     <w:rPr>
+      <w:rFonts w:ascii="Arial Unicode MS" w:hAnsi="Arial Unicode MS" w:eastAsia="Arial Unicode MS" w:cs="Arial Unicode MS"/>
       <w:b/>
       <w:bCs/>
       <w:i/>
@@ -1355,6 +3652,7 @@
     <w:uiPriority w:val="30"/>
     <w:rsid w:val="00FC693F"/>
     <w:rPr>
+      <w:rFonts w:ascii="Arial Unicode MS" w:hAnsi="Arial Unicode MS" w:eastAsia="Arial Unicode MS" w:cs="Arial Unicode MS"/>
       <w:b/>
       <w:bCs/>
       <w:i/>
@@ -1369,6 +3667,7 @@
     <w:qFormat/>
     <w:rsid w:val="00FC693F"/>
     <w:rPr>
+      <w:rFonts w:ascii="Arial Unicode MS" w:hAnsi="Arial Unicode MS" w:eastAsia="Arial Unicode MS" w:cs="Arial Unicode MS"/>
       <w:i/>
       <w:iCs/>
       <w:color w:val="808080" w:themeColor="text1" w:themeTint="7F"/>
@@ -1381,6 +3680,7 @@
     <w:qFormat/>
     <w:rsid w:val="00FC693F"/>
     <w:rPr>
+      <w:rFonts w:ascii="Arial Unicode MS" w:hAnsi="Arial Unicode MS" w:eastAsia="Arial Unicode MS" w:cs="Arial Unicode MS"/>
       <w:b/>
       <w:bCs/>
       <w:i/>
@@ -1395,6 +3695,7 @@
     <w:qFormat/>
     <w:rsid w:val="00FC693F"/>
     <w:rPr>
+      <w:rFonts w:ascii="Arial Unicode MS" w:hAnsi="Arial Unicode MS" w:eastAsia="Arial Unicode MS" w:cs="Arial Unicode MS"/>
       <w:smallCaps/>
       <w:color w:val="C0504D" w:themeColor="accent2"/>
       <w:u w:val="single"/>
@@ -1407,6 +3708,7 @@
     <w:qFormat/>
     <w:rsid w:val="00FC693F"/>
     <w:rPr>
+      <w:rFonts w:ascii="Arial Unicode MS" w:hAnsi="Arial Unicode MS" w:eastAsia="Arial Unicode MS" w:cs="Arial Unicode MS"/>
       <w:b/>
       <w:bCs/>
       <w:smallCaps/>
@@ -1422,6 +3724,7 @@
     <w:qFormat/>
     <w:rsid w:val="00FC693F"/>
     <w:rPr>
+      <w:rFonts w:ascii="Arial Unicode MS" w:hAnsi="Arial Unicode MS" w:eastAsia="Arial Unicode MS" w:cs="Arial Unicode MS"/>
       <w:b/>
       <w:bCs/>
       <w:smallCaps/>
@@ -1476,6 +3779,7 @@
       <w:spacing w:after="0" w:line="240" w:lineRule="auto"/>
     </w:pPr>
     <w:rPr>
+      <w:rFonts w:ascii="Arial Unicode MS" w:hAnsi="Arial Unicode MS" w:eastAsia="Arial Unicode MS" w:cs="Arial Unicode MS"/>
       <w:color w:val="000000" w:themeColor="text1" w:themeShade="BF"/>
     </w:rPr>
     <w:tblPr>
@@ -1579,6 +3883,7 @@
       <w:spacing w:after="0" w:line="240" w:lineRule="auto"/>
     </w:pPr>
     <w:rPr>
+      <w:rFonts w:ascii="Arial Unicode MS" w:hAnsi="Arial Unicode MS" w:eastAsia="Arial Unicode MS" w:cs="Arial Unicode MS"/>
       <w:color w:val="365F91" w:themeColor="accent1" w:themeShade="BF"/>
     </w:rPr>
     <w:tblPr>
@@ -1682,6 +3987,7 @@
       <w:spacing w:after="0" w:line="240" w:lineRule="auto"/>
     </w:pPr>
     <w:rPr>
+      <w:rFonts w:ascii="Arial Unicode MS" w:hAnsi="Arial Unicode MS" w:eastAsia="Arial Unicode MS" w:cs="Arial Unicode MS"/>
       <w:color w:val="943634" w:themeColor="accent2" w:themeShade="BF"/>
     </w:rPr>
     <w:tblPr>
@@ -1785,6 +4091,7 @@
       <w:spacing w:after="0" w:line="240" w:lineRule="auto"/>
     </w:pPr>
     <w:rPr>
+      <w:rFonts w:ascii="Arial Unicode MS" w:hAnsi="Arial Unicode MS" w:eastAsia="Arial Unicode MS" w:cs="Arial Unicode MS"/>
       <w:color w:val="76923C" w:themeColor="accent3" w:themeShade="BF"/>
     </w:rPr>
     <w:tblPr>
@@ -1888,6 +4195,7 @@
       <w:spacing w:after="0" w:line="240" w:lineRule="auto"/>
     </w:pPr>
     <w:rPr>
+      <w:rFonts w:ascii="Arial Unicode MS" w:hAnsi="Arial Unicode MS" w:eastAsia="Arial Unicode MS" w:cs="Arial Unicode MS"/>
       <w:color w:val="5F497A" w:themeColor="accent4" w:themeShade="BF"/>
     </w:rPr>
     <w:tblPr>
@@ -1991,6 +4299,7 @@
       <w:spacing w:after="0" w:line="240" w:lineRule="auto"/>
     </w:pPr>
     <w:rPr>
+      <w:rFonts w:ascii="Arial Unicode MS" w:hAnsi="Arial Unicode MS" w:eastAsia="Arial Unicode MS" w:cs="Arial Unicode MS"/>
       <w:color w:val="31849B" w:themeColor="accent5" w:themeShade="BF"/>
     </w:rPr>
     <w:tblPr>
@@ -2094,6 +4403,7 @@
       <w:spacing w:after="0" w:line="240" w:lineRule="auto"/>
     </w:pPr>
     <w:rPr>
+      <w:rFonts w:ascii="Arial Unicode MS" w:hAnsi="Arial Unicode MS" w:eastAsia="Arial Unicode MS" w:cs="Arial Unicode MS"/>
       <w:color w:val="E36C0A" w:themeColor="accent6" w:themeShade="BF"/>
     </w:rPr>
     <w:tblPr>
@@ -5536,6 +7846,7 @@
       <w:spacing w:after="0" w:line="240" w:lineRule="auto"/>
     </w:pPr>
     <w:rPr>
+      <w:rFonts w:ascii="Arial Unicode MS" w:hAnsi="Arial Unicode MS" w:eastAsia="Arial Unicode MS" w:cs="Arial Unicode MS"/>
       <w:color w:val="000000" w:themeColor="text1"/>
     </w:rPr>
     <w:tblPr>
@@ -5620,6 +7931,7 @@
       <w:spacing w:after="0" w:line="240" w:lineRule="auto"/>
     </w:pPr>
     <w:rPr>
+      <w:rFonts w:ascii="Arial Unicode MS" w:hAnsi="Arial Unicode MS" w:eastAsia="Arial Unicode MS" w:cs="Arial Unicode MS"/>
       <w:color w:val="000000" w:themeColor="text1"/>
     </w:rPr>
     <w:tblPr>
@@ -5704,6 +8016,7 @@
       <w:spacing w:after="0" w:line="240" w:lineRule="auto"/>
     </w:pPr>
     <w:rPr>
+      <w:rFonts w:ascii="Arial Unicode MS" w:hAnsi="Arial Unicode MS" w:eastAsia="Arial Unicode MS" w:cs="Arial Unicode MS"/>
       <w:color w:val="000000" w:themeColor="text1"/>
     </w:rPr>
     <w:tblPr>
@@ -5788,6 +8101,7 @@
       <w:spacing w:after="0" w:line="240" w:lineRule="auto"/>
     </w:pPr>
     <w:rPr>
+      <w:rFonts w:ascii="Arial Unicode MS" w:hAnsi="Arial Unicode MS" w:eastAsia="Arial Unicode MS" w:cs="Arial Unicode MS"/>
       <w:color w:val="000000" w:themeColor="text1"/>
     </w:rPr>
     <w:tblPr>
@@ -5872,6 +8186,7 @@
       <w:spacing w:after="0" w:line="240" w:lineRule="auto"/>
     </w:pPr>
     <w:rPr>
+      <w:rFonts w:ascii="Arial Unicode MS" w:hAnsi="Arial Unicode MS" w:eastAsia="Arial Unicode MS" w:cs="Arial Unicode MS"/>
       <w:color w:val="000000" w:themeColor="text1"/>
     </w:rPr>
     <w:tblPr>
@@ -5956,6 +8271,7 @@
       <w:spacing w:after="0" w:line="240" w:lineRule="auto"/>
     </w:pPr>
     <w:rPr>
+      <w:rFonts w:ascii="Arial Unicode MS" w:hAnsi="Arial Unicode MS" w:eastAsia="Arial Unicode MS" w:cs="Arial Unicode MS"/>
       <w:color w:val="000000" w:themeColor="text1"/>
     </w:rPr>
     <w:tblPr>
@@ -6040,6 +8356,7 @@
       <w:spacing w:after="0" w:line="240" w:lineRule="auto"/>
     </w:pPr>
     <w:rPr>
+      <w:rFonts w:ascii="Arial Unicode MS" w:hAnsi="Arial Unicode MS" w:eastAsia="Arial Unicode MS" w:cs="Arial Unicode MS"/>
       <w:color w:val="000000" w:themeColor="text1"/>
     </w:rPr>
     <w:tblPr>
@@ -6124,7 +8441,7 @@
       <w:spacing w:after="0" w:line="240" w:lineRule="auto"/>
     </w:pPr>
     <w:rPr>
-      <w:rFonts w:asciiTheme="majorHAnsi" w:eastAsiaTheme="majorEastAsia" w:hAnsiTheme="majorHAnsi" w:cstheme="majorBidi"/>
+      <w:rFonts w:asciiTheme="majorHAnsi" w:eastAsiaTheme="majorEastAsia" w:hAnsiTheme="majorHAnsi" w:cstheme="majorBidi" w:ascii="Arial Unicode MS" w:hAnsi="Arial Unicode MS" w:eastAsia="Arial Unicode MS" w:cs="Arial Unicode MS"/>
       <w:color w:val="000000" w:themeColor="text1"/>
     </w:rPr>
     <w:tblPr>
@@ -6252,7 +8569,7 @@
       <w:spacing w:after="0" w:line="240" w:lineRule="auto"/>
     </w:pPr>
     <w:rPr>
-      <w:rFonts w:asciiTheme="majorHAnsi" w:eastAsiaTheme="majorEastAsia" w:hAnsiTheme="majorHAnsi" w:cstheme="majorBidi"/>
+      <w:rFonts w:asciiTheme="majorHAnsi" w:eastAsiaTheme="majorEastAsia" w:hAnsiTheme="majorHAnsi" w:cstheme="majorBidi" w:ascii="Arial Unicode MS" w:hAnsi="Arial Unicode MS" w:eastAsia="Arial Unicode MS" w:cs="Arial Unicode MS"/>
       <w:color w:val="000000" w:themeColor="text1"/>
     </w:rPr>
     <w:tblPr>
@@ -6380,7 +8697,7 @@
       <w:spacing w:after="0" w:line="240" w:lineRule="auto"/>
     </w:pPr>
     <w:rPr>
-      <w:rFonts w:asciiTheme="majorHAnsi" w:eastAsiaTheme="majorEastAsia" w:hAnsiTheme="majorHAnsi" w:cstheme="majorBidi"/>
+      <w:rFonts w:asciiTheme="majorHAnsi" w:eastAsiaTheme="majorEastAsia" w:hAnsiTheme="majorHAnsi" w:cstheme="majorBidi" w:ascii="Arial Unicode MS" w:hAnsi="Arial Unicode MS" w:eastAsia="Arial Unicode MS" w:cs="Arial Unicode MS"/>
       <w:color w:val="000000" w:themeColor="text1"/>
     </w:rPr>
     <w:tblPr>
@@ -6508,7 +8825,7 @@
       <w:spacing w:after="0" w:line="240" w:lineRule="auto"/>
     </w:pPr>
     <w:rPr>
-      <w:rFonts w:asciiTheme="majorHAnsi" w:eastAsiaTheme="majorEastAsia" w:hAnsiTheme="majorHAnsi" w:cstheme="majorBidi"/>
+      <w:rFonts w:asciiTheme="majorHAnsi" w:eastAsiaTheme="majorEastAsia" w:hAnsiTheme="majorHAnsi" w:cstheme="majorBidi" w:ascii="Arial Unicode MS" w:hAnsi="Arial Unicode MS" w:eastAsia="Arial Unicode MS" w:cs="Arial Unicode MS"/>
       <w:color w:val="000000" w:themeColor="text1"/>
     </w:rPr>
     <w:tblPr>
@@ -6636,7 +8953,7 @@
       <w:spacing w:after="0" w:line="240" w:lineRule="auto"/>
     </w:pPr>
     <w:rPr>
-      <w:rFonts w:asciiTheme="majorHAnsi" w:eastAsiaTheme="majorEastAsia" w:hAnsiTheme="majorHAnsi" w:cstheme="majorBidi"/>
+      <w:rFonts w:asciiTheme="majorHAnsi" w:eastAsiaTheme="majorEastAsia" w:hAnsiTheme="majorHAnsi" w:cstheme="majorBidi" w:ascii="Arial Unicode MS" w:hAnsi="Arial Unicode MS" w:eastAsia="Arial Unicode MS" w:cs="Arial Unicode MS"/>
       <w:color w:val="000000" w:themeColor="text1"/>
     </w:rPr>
     <w:tblPr>
@@ -6764,7 +9081,7 @@
       <w:spacing w:after="0" w:line="240" w:lineRule="auto"/>
     </w:pPr>
     <w:rPr>
-      <w:rFonts w:asciiTheme="majorHAnsi" w:eastAsiaTheme="majorEastAsia" w:hAnsiTheme="majorHAnsi" w:cstheme="majorBidi"/>
+      <w:rFonts w:asciiTheme="majorHAnsi" w:eastAsiaTheme="majorEastAsia" w:hAnsiTheme="majorHAnsi" w:cstheme="majorBidi" w:ascii="Arial Unicode MS" w:hAnsi="Arial Unicode MS" w:eastAsia="Arial Unicode MS" w:cs="Arial Unicode MS"/>
       <w:color w:val="000000" w:themeColor="text1"/>
     </w:rPr>
     <w:tblPr>
@@ -6892,7 +9209,7 @@
       <w:spacing w:after="0" w:line="240" w:lineRule="auto"/>
     </w:pPr>
     <w:rPr>
-      <w:rFonts w:asciiTheme="majorHAnsi" w:eastAsiaTheme="majorEastAsia" w:hAnsiTheme="majorHAnsi" w:cstheme="majorBidi"/>
+      <w:rFonts w:asciiTheme="majorHAnsi" w:eastAsiaTheme="majorEastAsia" w:hAnsiTheme="majorHAnsi" w:cstheme="majorBidi" w:ascii="Arial Unicode MS" w:hAnsi="Arial Unicode MS" w:eastAsia="Arial Unicode MS" w:cs="Arial Unicode MS"/>
       <w:color w:val="000000" w:themeColor="text1"/>
     </w:rPr>
     <w:tblPr>
@@ -7531,7 +9848,7 @@
       <w:spacing w:after="0" w:line="240" w:lineRule="auto"/>
     </w:pPr>
     <w:rPr>
-      <w:rFonts w:asciiTheme="majorHAnsi" w:eastAsiaTheme="majorEastAsia" w:hAnsiTheme="majorHAnsi" w:cstheme="majorBidi"/>
+      <w:rFonts w:asciiTheme="majorHAnsi" w:eastAsiaTheme="majorEastAsia" w:hAnsiTheme="majorHAnsi" w:cstheme="majorBidi" w:ascii="Arial Unicode MS" w:hAnsi="Arial Unicode MS" w:eastAsia="Arial Unicode MS" w:cs="Arial Unicode MS"/>
       <w:color w:val="000000" w:themeColor="text1"/>
     </w:rPr>
     <w:tblPr>
@@ -7656,7 +9973,7 @@
       <w:spacing w:after="0" w:line="240" w:lineRule="auto"/>
     </w:pPr>
     <w:rPr>
-      <w:rFonts w:asciiTheme="majorHAnsi" w:eastAsiaTheme="majorEastAsia" w:hAnsiTheme="majorHAnsi" w:cstheme="majorBidi"/>
+      <w:rFonts w:asciiTheme="majorHAnsi" w:eastAsiaTheme="majorEastAsia" w:hAnsiTheme="majorHAnsi" w:cstheme="majorBidi" w:ascii="Arial Unicode MS" w:hAnsi="Arial Unicode MS" w:eastAsia="Arial Unicode MS" w:cs="Arial Unicode MS"/>
       <w:color w:val="000000" w:themeColor="text1"/>
     </w:rPr>
     <w:tblPr>
@@ -7781,7 +10098,7 @@
       <w:spacing w:after="0" w:line="240" w:lineRule="auto"/>
     </w:pPr>
     <w:rPr>
-      <w:rFonts w:asciiTheme="majorHAnsi" w:eastAsiaTheme="majorEastAsia" w:hAnsiTheme="majorHAnsi" w:cstheme="majorBidi"/>
+      <w:rFonts w:asciiTheme="majorHAnsi" w:eastAsiaTheme="majorEastAsia" w:hAnsiTheme="majorHAnsi" w:cstheme="majorBidi" w:ascii="Arial Unicode MS" w:hAnsi="Arial Unicode MS" w:eastAsia="Arial Unicode MS" w:cs="Arial Unicode MS"/>
       <w:color w:val="000000" w:themeColor="text1"/>
     </w:rPr>
     <w:tblPr>
@@ -7906,7 +10223,7 @@
       <w:spacing w:after="0" w:line="240" w:lineRule="auto"/>
     </w:pPr>
     <w:rPr>
-      <w:rFonts w:asciiTheme="majorHAnsi" w:eastAsiaTheme="majorEastAsia" w:hAnsiTheme="majorHAnsi" w:cstheme="majorBidi"/>
+      <w:rFonts w:asciiTheme="majorHAnsi" w:eastAsiaTheme="majorEastAsia" w:hAnsiTheme="majorHAnsi" w:cstheme="majorBidi" w:ascii="Arial Unicode MS" w:hAnsi="Arial Unicode MS" w:eastAsia="Arial Unicode MS" w:cs="Arial Unicode MS"/>
       <w:color w:val="000000" w:themeColor="text1"/>
     </w:rPr>
     <w:tblPr>
@@ -8031,7 +10348,7 @@
       <w:spacing w:after="0" w:line="240" w:lineRule="auto"/>
     </w:pPr>
     <w:rPr>
-      <w:rFonts w:asciiTheme="majorHAnsi" w:eastAsiaTheme="majorEastAsia" w:hAnsiTheme="majorHAnsi" w:cstheme="majorBidi"/>
+      <w:rFonts w:asciiTheme="majorHAnsi" w:eastAsiaTheme="majorEastAsia" w:hAnsiTheme="majorHAnsi" w:cstheme="majorBidi" w:ascii="Arial Unicode MS" w:hAnsi="Arial Unicode MS" w:eastAsia="Arial Unicode MS" w:cs="Arial Unicode MS"/>
       <w:color w:val="000000" w:themeColor="text1"/>
     </w:rPr>
     <w:tblPr>
@@ -8156,7 +10473,7 @@
       <w:spacing w:after="0" w:line="240" w:lineRule="auto"/>
     </w:pPr>
     <w:rPr>
-      <w:rFonts w:asciiTheme="majorHAnsi" w:eastAsiaTheme="majorEastAsia" w:hAnsiTheme="majorHAnsi" w:cstheme="majorBidi"/>
+      <w:rFonts w:asciiTheme="majorHAnsi" w:eastAsiaTheme="majorEastAsia" w:hAnsiTheme="majorHAnsi" w:cstheme="majorBidi" w:ascii="Arial Unicode MS" w:hAnsi="Arial Unicode MS" w:eastAsia="Arial Unicode MS" w:cs="Arial Unicode MS"/>
       <w:color w:val="000000" w:themeColor="text1"/>
     </w:rPr>
     <w:tblPr>
@@ -8281,7 +10598,7 @@
       <w:spacing w:after="0" w:line="240" w:lineRule="auto"/>
     </w:pPr>
     <w:rPr>
-      <w:rFonts w:asciiTheme="majorHAnsi" w:eastAsiaTheme="majorEastAsia" w:hAnsiTheme="majorHAnsi" w:cstheme="majorBidi"/>
+      <w:rFonts w:asciiTheme="majorHAnsi" w:eastAsiaTheme="majorEastAsia" w:hAnsiTheme="majorHAnsi" w:cstheme="majorBidi" w:ascii="Arial Unicode MS" w:hAnsi="Arial Unicode MS" w:eastAsia="Arial Unicode MS" w:cs="Arial Unicode MS"/>
       <w:color w:val="000000" w:themeColor="text1"/>
     </w:rPr>
     <w:tblPr>
@@ -9393,6 +11710,7 @@
       <w:spacing w:after="0" w:line="240" w:lineRule="auto"/>
     </w:pPr>
     <w:rPr>
+      <w:rFonts w:ascii="Arial Unicode MS" w:hAnsi="Arial Unicode MS" w:eastAsia="Arial Unicode MS" w:cs="Arial Unicode MS"/>
       <w:color w:val="FFFFFF" w:themeColor="background1"/>
     </w:rPr>
     <w:tblPr>
@@ -9507,6 +11825,7 @@
       <w:spacing w:after="0" w:line="240" w:lineRule="auto"/>
     </w:pPr>
     <w:rPr>
+      <w:rFonts w:ascii="Arial Unicode MS" w:hAnsi="Arial Unicode MS" w:eastAsia="Arial Unicode MS" w:cs="Arial Unicode MS"/>
       <w:color w:val="FFFFFF" w:themeColor="background1"/>
     </w:rPr>
     <w:tblPr>
@@ -9621,6 +11940,7 @@
       <w:spacing w:after="0" w:line="240" w:lineRule="auto"/>
     </w:pPr>
     <w:rPr>
+      <w:rFonts w:ascii="Arial Unicode MS" w:hAnsi="Arial Unicode MS" w:eastAsia="Arial Unicode MS" w:cs="Arial Unicode MS"/>
       <w:color w:val="FFFFFF" w:themeColor="background1"/>
     </w:rPr>
     <w:tblPr>
@@ -9735,6 +12055,7 @@
       <w:spacing w:after="0" w:line="240" w:lineRule="auto"/>
     </w:pPr>
     <w:rPr>
+      <w:rFonts w:ascii="Arial Unicode MS" w:hAnsi="Arial Unicode MS" w:eastAsia="Arial Unicode MS" w:cs="Arial Unicode MS"/>
       <w:color w:val="FFFFFF" w:themeColor="background1"/>
     </w:rPr>
     <w:tblPr>
@@ -9849,6 +12170,7 @@
       <w:spacing w:after="0" w:line="240" w:lineRule="auto"/>
     </w:pPr>
     <w:rPr>
+      <w:rFonts w:ascii="Arial Unicode MS" w:hAnsi="Arial Unicode MS" w:eastAsia="Arial Unicode MS" w:cs="Arial Unicode MS"/>
       <w:color w:val="FFFFFF" w:themeColor="background1"/>
     </w:rPr>
     <w:tblPr>
@@ -9963,6 +12285,7 @@
       <w:spacing w:after="0" w:line="240" w:lineRule="auto"/>
     </w:pPr>
     <w:rPr>
+      <w:rFonts w:ascii="Arial Unicode MS" w:hAnsi="Arial Unicode MS" w:eastAsia="Arial Unicode MS" w:cs="Arial Unicode MS"/>
       <w:color w:val="FFFFFF" w:themeColor="background1"/>
     </w:rPr>
     <w:tblPr>
@@ -10077,6 +12400,7 @@
       <w:spacing w:after="0" w:line="240" w:lineRule="auto"/>
     </w:pPr>
     <w:rPr>
+      <w:rFonts w:ascii="Arial Unicode MS" w:hAnsi="Arial Unicode MS" w:eastAsia="Arial Unicode MS" w:cs="Arial Unicode MS"/>
       <w:color w:val="FFFFFF" w:themeColor="background1"/>
     </w:rPr>
     <w:tblPr>
@@ -10191,6 +12515,7 @@
       <w:spacing w:after="0" w:line="240" w:lineRule="auto"/>
     </w:pPr>
     <w:rPr>
+      <w:rFonts w:ascii="Arial Unicode MS" w:hAnsi="Arial Unicode MS" w:eastAsia="Arial Unicode MS" w:cs="Arial Unicode MS"/>
       <w:color w:val="000000" w:themeColor="text1"/>
     </w:rPr>
     <w:tblPr>
@@ -10313,6 +12638,7 @@
       <w:spacing w:after="0" w:line="240" w:lineRule="auto"/>
     </w:pPr>
     <w:rPr>
+      <w:rFonts w:ascii="Arial Unicode MS" w:hAnsi="Arial Unicode MS" w:eastAsia="Arial Unicode MS" w:cs="Arial Unicode MS"/>
       <w:color w:val="000000" w:themeColor="text1"/>
     </w:rPr>
     <w:tblPr>
@@ -10435,6 +12761,7 @@
       <w:spacing w:after="0" w:line="240" w:lineRule="auto"/>
     </w:pPr>
     <w:rPr>
+      <w:rFonts w:ascii="Arial Unicode MS" w:hAnsi="Arial Unicode MS" w:eastAsia="Arial Unicode MS" w:cs="Arial Unicode MS"/>
       <w:color w:val="000000" w:themeColor="text1"/>
     </w:rPr>
     <w:tblPr>
@@ -10557,6 +12884,7 @@
       <w:spacing w:after="0" w:line="240" w:lineRule="auto"/>
     </w:pPr>
     <w:rPr>
+      <w:rFonts w:ascii="Arial Unicode MS" w:hAnsi="Arial Unicode MS" w:eastAsia="Arial Unicode MS" w:cs="Arial Unicode MS"/>
       <w:color w:val="000000" w:themeColor="text1"/>
     </w:rPr>
     <w:tblPr>
@@ -10669,6 +12997,7 @@
       <w:spacing w:after="0" w:line="240" w:lineRule="auto"/>
     </w:pPr>
     <w:rPr>
+      <w:rFonts w:ascii="Arial Unicode MS" w:hAnsi="Arial Unicode MS" w:eastAsia="Arial Unicode MS" w:cs="Arial Unicode MS"/>
       <w:color w:val="000000" w:themeColor="text1"/>
     </w:rPr>
     <w:tblPr>
@@ -10791,6 +13120,7 @@
       <w:spacing w:after="0" w:line="240" w:lineRule="auto"/>
     </w:pPr>
     <w:rPr>
+      <w:rFonts w:ascii="Arial Unicode MS" w:hAnsi="Arial Unicode MS" w:eastAsia="Arial Unicode MS" w:cs="Arial Unicode MS"/>
       <w:color w:val="000000" w:themeColor="text1"/>
     </w:rPr>
     <w:tblPr>
@@ -10913,6 +13243,7 @@
       <w:spacing w:after="0" w:line="240" w:lineRule="auto"/>
     </w:pPr>
     <w:rPr>
+      <w:rFonts w:ascii="Arial Unicode MS" w:hAnsi="Arial Unicode MS" w:eastAsia="Arial Unicode MS" w:cs="Arial Unicode MS"/>
       <w:color w:val="000000" w:themeColor="text1"/>
     </w:rPr>
     <w:tblPr>
@@ -11035,6 +13366,7 @@
       <w:spacing w:after="0" w:line="240" w:lineRule="auto"/>
     </w:pPr>
     <w:rPr>
+      <w:rFonts w:ascii="Arial Unicode MS" w:hAnsi="Arial Unicode MS" w:eastAsia="Arial Unicode MS" w:cs="Arial Unicode MS"/>
       <w:color w:val="000000" w:themeColor="text1"/>
     </w:rPr>
     <w:tblPr>
@@ -11121,6 +13453,7 @@
       <w:spacing w:after="0" w:line="240" w:lineRule="auto"/>
     </w:pPr>
     <w:rPr>
+      <w:rFonts w:ascii="Arial Unicode MS" w:hAnsi="Arial Unicode MS" w:eastAsia="Arial Unicode MS" w:cs="Arial Unicode MS"/>
       <w:color w:val="000000" w:themeColor="text1"/>
     </w:rPr>
     <w:tblPr>
@@ -11207,6 +13540,7 @@
       <w:spacing w:after="0" w:line="240" w:lineRule="auto"/>
     </w:pPr>
     <w:rPr>
+      <w:rFonts w:ascii="Arial Unicode MS" w:hAnsi="Arial Unicode MS" w:eastAsia="Arial Unicode MS" w:cs="Arial Unicode MS"/>
       <w:color w:val="000000" w:themeColor="text1"/>
     </w:rPr>
     <w:tblPr>
@@ -11293,6 +13627,7 @@
       <w:spacing w:after="0" w:line="240" w:lineRule="auto"/>
     </w:pPr>
     <w:rPr>
+      <w:rFonts w:ascii="Arial Unicode MS" w:hAnsi="Arial Unicode MS" w:eastAsia="Arial Unicode MS" w:cs="Arial Unicode MS"/>
       <w:color w:val="000000" w:themeColor="text1"/>
     </w:rPr>
     <w:tblPr>
@@ -11379,6 +13714,7 @@
       <w:spacing w:after="0" w:line="240" w:lineRule="auto"/>
     </w:pPr>
     <w:rPr>
+      <w:rFonts w:ascii="Arial Unicode MS" w:hAnsi="Arial Unicode MS" w:eastAsia="Arial Unicode MS" w:cs="Arial Unicode MS"/>
       <w:color w:val="000000" w:themeColor="text1"/>
     </w:rPr>
     <w:tblPr>
@@ -11465,6 +13801,7 @@
       <w:spacing w:after="0" w:line="240" w:lineRule="auto"/>
     </w:pPr>
     <w:rPr>
+      <w:rFonts w:ascii="Arial Unicode MS" w:hAnsi="Arial Unicode MS" w:eastAsia="Arial Unicode MS" w:cs="Arial Unicode MS"/>
       <w:color w:val="000000" w:themeColor="text1"/>
     </w:rPr>
     <w:tblPr>
@@ -11551,6 +13888,7 @@
       <w:spacing w:after="0" w:line="240" w:lineRule="auto"/>
     </w:pPr>
     <w:rPr>
+      <w:rFonts w:ascii="Arial Unicode MS" w:hAnsi="Arial Unicode MS" w:eastAsia="Arial Unicode MS" w:cs="Arial Unicode MS"/>
       <w:color w:val="000000" w:themeColor="text1"/>
     </w:rPr>
     <w:tblPr>
@@ -11637,6 +13975,7 @@
       <w:spacing w:after="0" w:line="240" w:lineRule="auto"/>
     </w:pPr>
     <w:rPr>
+      <w:rFonts w:ascii="Arial Unicode MS" w:hAnsi="Arial Unicode MS" w:eastAsia="Arial Unicode MS" w:cs="Arial Unicode MS"/>
       <w:color w:val="000000" w:themeColor="text1"/>
     </w:rPr>
     <w:tblPr>
@@ -11717,6 +14056,7 @@
       <w:spacing w:after="0" w:line="240" w:lineRule="auto"/>
     </w:pPr>
     <w:rPr>
+      <w:rFonts w:ascii="Arial Unicode MS" w:hAnsi="Arial Unicode MS" w:eastAsia="Arial Unicode MS" w:cs="Arial Unicode MS"/>
       <w:color w:val="000000" w:themeColor="text1"/>
     </w:rPr>
     <w:tblPr>
@@ -11797,6 +14137,7 @@
       <w:spacing w:after="0" w:line="240" w:lineRule="auto"/>
     </w:pPr>
     <w:rPr>
+      <w:rFonts w:ascii="Arial Unicode MS" w:hAnsi="Arial Unicode MS" w:eastAsia="Arial Unicode MS" w:cs="Arial Unicode MS"/>
       <w:color w:val="000000" w:themeColor="text1"/>
     </w:rPr>
     <w:tblPr>
@@ -11877,6 +14218,7 @@
       <w:spacing w:after="0" w:line="240" w:lineRule="auto"/>
     </w:pPr>
     <w:rPr>
+      <w:rFonts w:ascii="Arial Unicode MS" w:hAnsi="Arial Unicode MS" w:eastAsia="Arial Unicode MS" w:cs="Arial Unicode MS"/>
       <w:color w:val="000000" w:themeColor="text1"/>
     </w:rPr>
     <w:tblPr>
@@ -11957,6 +14299,7 @@
       <w:spacing w:after="0" w:line="240" w:lineRule="auto"/>
     </w:pPr>
     <w:rPr>
+      <w:rFonts w:ascii="Arial Unicode MS" w:hAnsi="Arial Unicode MS" w:eastAsia="Arial Unicode MS" w:cs="Arial Unicode MS"/>
       <w:color w:val="000000" w:themeColor="text1"/>
     </w:rPr>
     <w:tblPr>
@@ -12037,6 +14380,7 @@
       <w:spacing w:after="0" w:line="240" w:lineRule="auto"/>
     </w:pPr>
     <w:rPr>
+      <w:rFonts w:ascii="Arial Unicode MS" w:hAnsi="Arial Unicode MS" w:eastAsia="Arial Unicode MS" w:cs="Arial Unicode MS"/>
       <w:color w:val="000000" w:themeColor="text1"/>
     </w:rPr>
     <w:tblPr>
@@ -12117,6 +14461,7 @@
       <w:spacing w:after="0" w:line="240" w:lineRule="auto"/>
     </w:pPr>
     <w:rPr>
+      <w:rFonts w:ascii="Arial Unicode MS" w:hAnsi="Arial Unicode MS" w:eastAsia="Arial Unicode MS" w:cs="Arial Unicode MS"/>
       <w:color w:val="000000" w:themeColor="text1"/>
     </w:rPr>
     <w:tblPr>

</xml_diff>